<commit_message>
Perbarui pembagian peran Kelompok 1
Aditya: Leader & Evaluator; Amar: Presenter; Amelia: Designer; Jovi: Researcher; Syakirah: Programmer.
Diterapkan di tabel §1 laporan, README, dan peta laporan (hash baru).

Co-Authored-By: Claude Opus 5 (1M context) <noreply@anthropic.com>
</commit_message>
<xml_diff>
--- a/Laporan_Multi_Agent_Email_Writer_Enrichment_Kelompok_1.docx
+++ b/Laporan_Multi_Agent_Email_Writer_Enrichment_Kelompok_1.docx
@@ -308,7 +308,7 @@
                 <w:b w:val="0"/>
                 <w:sz w:val="18"/>
               </w:rPr>
-              <w:t>Leader &amp; Presenter</w:t>
+              <w:t>Leader &amp; Evaluator</w:t>
             </w:r>
           </w:p>
         </w:tc>
@@ -388,7 +388,7 @@
                 <w:b w:val="0"/>
                 <w:sz w:val="18"/>
               </w:rPr>
-              <w:t>Programmer</w:t>
+              <w:t>Presenter</w:t>
             </w:r>
           </w:p>
         </w:tc>
@@ -628,7 +628,7 @@
                 <w:b w:val="0"/>
                 <w:sz w:val="18"/>
               </w:rPr>
-              <w:t>Evaluator</w:t>
+              <w:t>Programmer</w:t>
             </w:r>
           </w:p>
         </w:tc>

</xml_diff>

<commit_message>
Revisi laporan sesuai prototipe dan deck presentasi
- Laporan: §5.4 realisasi prototipe, §7.3 autentikasi Google, §8.4 tangkapan layar (Gambar 5-8),
  §9.3 hasil pengujian (43 tes, simulasi 100 lead), §12 repositori, referensi [17]-[19];
  peran final di §1; cadangan versi lama di backup/ (tidak di-commit)
- Presentasi: 17 slide 16:9 dengan catatan pembicara, dibangun dari presentasi/build-deck.js
- docs/gambar: tangkapan layar prototipe (mode simulasi, data fiktif)
- tools/screenshot.mjs: mode rencana (skala 2x, potong elemen, aksi sebelum rekam)
- Alasan identitas ambigu memakai koma desimal

Co-Authored-By: Claude Opus 5 (1M context) <noreply@anthropic.com>
</commit_message>
<xml_diff>
--- a/Laporan_Multi_Agent_Email_Writer_Enrichment_Kelompok_1.docx
+++ b/Laporan_Multi_Agent_Email_Writer_Enrichment_Kelompok_1.docx
@@ -12,7 +12,7 @@
           <w:color w:val="17656B"/>
           <w:sz w:val="18"/>
         </w:rPr>
-        <w:t>LAPORAN PERANCANGAN</w:t>
+        <w:t>LAPORAN PERANCANGAN DAN PROTOTIPE</w:t>
       </w:r>
     </w:p>
     <w:p>
@@ -96,7 +96,7 @@
                 <w:b w:val="0"/>
                 <w:sz w:val="20"/>
               </w:rPr>
-              <w:t>Pengguna menentukan jumlah prospek, tujuan campaign, tingkat personalisasi, dan jadwal. Orchestrator mengoordinasikan enrichment melalui Apify, riset melalui Firecrawl, serta penulisan email berbasis LLM. Email hanya dikirim lewat Gmail API setelah lolos pemeriksaan dan disetujui pengguna. Google Sheets menjadi database prototipe.</w:t>
+              <w:t>Pengguna menentukan jumlah prospek, tujuan campaign, tingkat personalisasi, dan jadwal. Orchestrator mengoordinasikan enrichment melalui Apify, riset melalui Firecrawl, serta penulisan email berbasis LLM. Email hanya dikirim lewat Gmail API setelah lolos pemeriksaan dan disetujui pengguna. Google Sheets menjadi database prototipe. Prototipe fungsional telah dibangun dan diuji dengan tes otomatis serta simulasi data fiktif (Bagian 8.4 dan 9.3).</w:t>
             </w:r>
           </w:p>
         </w:tc>
@@ -134,7 +134,7 @@
         <w:rPr>
           <w:b w:val="0"/>
         </w:rPr>
-        <w:t xml:space="preserve"> Pembagian peran berikut merupakan usulan untuk proyek ini.</w:t>
+        <w:t xml:space="preserve"> Pembagian peran dalam proyek ini sebagai berikut.</w:t>
       </w:r>
     </w:p>
     <w:tbl>
@@ -228,7 +228,7 @@
                 <w:color w:val="FFFFFF"/>
                 <w:sz w:val="18"/>
               </w:rPr>
-              <w:t>Peran yang diusulkan</w:t>
+              <w:t>Peran</w:t>
             </w:r>
           </w:p>
         </w:tc>
@@ -1109,7 +1109,7 @@
           <w:b w:val="0"/>
           <w:sz w:val="18"/>
         </w:rPr>
-        <w:t xml:space="preserve"> rancangan konseptual dan rencana prototipe, bukan klaim sistem sudah berjalan. Data contoh, mockup, serta estimasi kinerja bersifat ilustratif; belum ada uji lapangan atau pengiriman massal.</w:t>
+        <w:t xml:space="preserve"> rancangan konseptual beserta prototipe fungsional. Prototipe diuji dengan 43 tes otomatis dan simulasi 100 lead fiktif; belum ada uji lapangan, pengiriman massal, atau pengukuran kinerja dengan layanan berbayar. Data contoh, mockup, dan estimasi pada Bagian 9.2 tetap bersifat ilustratif.</w:t>
       </w:r>
     </w:p>
     <w:p>
@@ -2324,17 +2324,13 @@
           <w:b w:val="0"/>
           <w:sz w:val="19"/>
         </w:rPr>
-        <w:t xml:space="preserve"> prototipe yang menekankan keterlacakan bukti, pembagian konteks agen, dan eksperimen mobilitas, dengan spreadsheet sebagai sumber state utama.</w:t>
-      </w:r>
-    </w:p>
-    <w:p>
-      <w:r>
-        <w:br w:type="page"/>
+        <w:t xml:space="preserve"> prototipe yang menekankan keterlacakan bukti, pembagian konteks agen, dan eksperimen mobilitas, dengan spreadsheet sebagai sumber state utama. Rancangan ini telah direalisasikan sebagai prototipe fungsional (Bagian 5.4 dan 12).</w:t>
       </w:r>
     </w:p>
     <w:p>
       <w:pPr>
         <w:pStyle w:val="Heading1"/>
+        <w:pageBreakBefore/>
       </w:pPr>
       <w:r>
         <w:t>5. Desain Sistem Multi-Agent</w:t>
@@ -3400,6 +3396,774 @@
                 <w:sz w:val="19"/>
               </w:rPr>
               <w:t>Agen hanya berpindah antara runtime A dan B yang dikelola proyek. Agen tidak bermigrasi ke server Apify, Firecrawl, atau Gmail. Mobile UI dan mobile agent adalah dua konsep berbeda.</w:t>
+            </w:r>
+          </w:p>
+        </w:tc>
+      </w:tr>
+    </w:tbl>
+    <w:p>
+      <w:pPr>
+        <w:spacing w:after="0" w:before="0" w:line="240" w:lineRule="auto"/>
+      </w:pPr>
+      <w:r>
+        <w:rPr>
+          <w:sz w:val="4"/>
+        </w:rPr>
+      </w:r>
+    </w:p>
+    <w:p>
+      <w:r>
+        <w:br w:type="page"/>
+      </w:r>
+    </w:p>
+    <w:p>
+      <w:pPr>
+        <w:pStyle w:val="Heading2"/>
+      </w:pPr>
+      <w:r>
+        <w:t xml:space="preserve">5.4 Realisasi pada prototipe</w:t>
+      </w:r>
+    </w:p>
+    <w:p>
+      <w:r>
+        <w:rPr>
+          <w:b w:val="0"/>
+        </w:rPr>
+        <w:t xml:space="preserve">Rancangan pada Bagian 5.1–5.3 direalisasikan sebagai prototipe dengan backend Python (FastAPI) dan dashboard React + TypeScript. LLM diakses melalui OpenRouter dengan keluaran JSON sesuai skema [17]; model bawaan anthropic/claude-sonnet-5 dapat diganti lewat konfigurasi. Tabel berikut memetakan komponen rancangan ke implementasinya.</w:t>
+      </w:r>
+    </w:p>
+    <w:tbl>
+      <w:tblPr>
+        <w:tblW w:type="auto" w:w="0"/>
+        <w:jc w:val="center"/>
+        <w:tblLayout w:type="fixed"/>
+        <w:tblLook w:firstColumn="1" w:firstRow="1" w:lastColumn="0" w:lastRow="0" w:noHBand="0" w:noVBand="1" w:val="04A0"/>
+      </w:tblPr>
+      <w:tblGrid>
+        <w:gridCol w:w="2200"/>
+        <w:gridCol w:w="4978"/>
+        <w:gridCol w:w="2800"/>
+      </w:tblGrid>
+      <w:tr>
+        <w:trPr>
+          <w:cantSplit/>
+          <w:tblHeader/>
+        </w:trPr>
+        <w:tc>
+          <w:tcPr>
+            <w:tcW w:type="dxa" w:w="2200"/>
+            <w:vAlign w:val="center"/>
+            <w:tcMar>
+              <w:top w:w="80" w:type="dxa"/>
+              <w:left w:w="100" w:type="dxa"/>
+              <w:bottom w:w="80" w:type="dxa"/>
+              <w:right w:w="100" w:type="dxa"/>
+            </w:tcMar>
+            <w:shd w:fill="17656B"/>
+          </w:tcPr>
+          <w:p>
+            <w:pPr>
+              <w:spacing w:after="20" w:before="0" w:line="247" w:lineRule="auto"/>
+            </w:pPr>
+            <w:r>
+              <w:rPr>
+                <w:b/>
+                <w:color w:val="FFFFFF"/>
+                <w:sz w:val="18"/>
+              </w:rPr>
+              <w:t xml:space="preserve">Komponen rancangan</w:t>
+            </w:r>
+          </w:p>
+        </w:tc>
+        <w:tc>
+          <w:tcPr>
+            <w:tcW w:type="dxa" w:w="4978"/>
+            <w:vAlign w:val="center"/>
+            <w:tcMar>
+              <w:top w:w="80" w:type="dxa"/>
+              <w:left w:w="100" w:type="dxa"/>
+              <w:bottom w:w="80" w:type="dxa"/>
+              <w:right w:w="100" w:type="dxa"/>
+            </w:tcMar>
+            <w:shd w:fill="17656B"/>
+          </w:tcPr>
+          <w:p>
+            <w:pPr>
+              <w:spacing w:after="20" w:before="0" w:line="247" w:lineRule="auto"/>
+            </w:pPr>
+            <w:r>
+              <w:rPr>
+                <w:b/>
+                <w:color w:val="FFFFFF"/>
+                <w:sz w:val="18"/>
+              </w:rPr>
+              <w:t xml:space="preserve">Realisasi pada prototipe</w:t>
+            </w:r>
+          </w:p>
+        </w:tc>
+        <w:tc>
+          <w:tcPr>
+            <w:tcW w:type="dxa" w:w="2800"/>
+            <w:vAlign w:val="center"/>
+            <w:tcMar>
+              <w:top w:w="80" w:type="dxa"/>
+              <w:left w:w="100" w:type="dxa"/>
+              <w:bottom w:w="80" w:type="dxa"/>
+              <w:right w:w="100" w:type="dxa"/>
+            </w:tcMar>
+            <w:shd w:fill="17656B"/>
+          </w:tcPr>
+          <w:p>
+            <w:pPr>
+              <w:spacing w:after="20" w:before="0" w:line="247" w:lineRule="auto"/>
+            </w:pPr>
+            <w:r>
+              <w:rPr>
+                <w:b/>
+                <w:color w:val="FFFFFF"/>
+                <w:sz w:val="18"/>
+              </w:rPr>
+              <w:t xml:space="preserve">Batas yang disadari</w:t>
+            </w:r>
+          </w:p>
+        </w:tc>
+      </w:tr>
+      <w:tr>
+        <w:trPr>
+          <w:cantSplit/>
+        </w:trPr>
+        <w:tc>
+          <w:tcPr>
+            <w:tcW w:type="dxa" w:w="2200"/>
+            <w:vAlign w:val="center"/>
+            <w:tcMar>
+              <w:top w:w="80" w:type="dxa"/>
+              <w:left w:w="100" w:type="dxa"/>
+              <w:bottom w:w="80" w:type="dxa"/>
+              <w:right w:w="100" w:type="dxa"/>
+            </w:tcMar>
+            <w:shd w:fill="F5F8F9"/>
+          </w:tcPr>
+          <w:p>
+            <w:pPr>
+              <w:spacing w:after="20" w:before="0" w:line="247" w:lineRule="auto"/>
+            </w:pPr>
+            <w:r>
+              <w:rPr>
+                <w:b w:val="0"/>
+                <w:sz w:val="18"/>
+              </w:rPr>
+              <w:t xml:space="preserve">Orchestrator / Broker</w:t>
+            </w:r>
+          </w:p>
+        </w:tc>
+        <w:tc>
+          <w:tcPr>
+            <w:tcW w:type="dxa" w:w="4978"/>
+            <w:vAlign w:val="center"/>
+            <w:tcMar>
+              <w:top w:w="80" w:type="dxa"/>
+              <w:left w:w="100" w:type="dxa"/>
+              <w:bottom w:w="80" w:type="dxa"/>
+              <w:right w:w="100" w:type="dxa"/>
+            </w:tcMar>
+            <w:shd w:fill="F5F8F9"/>
+          </w:tcPr>
+          <w:p>
+            <w:pPr>
+              <w:spacing w:after="20" w:before="0" w:line="247" w:lineRule="auto"/>
+            </w:pPr>
+            <w:r>
+              <w:rPr>
+                <w:b w:val="0"/>
+                <w:sz w:val="18"/>
+              </w:rPr>
+              <w:t xml:space="preserve">State machine per lead; Contract Net ke runtime A/B (CFP, PROPOSE, ACCEPT/REJECT); checkpoint, lease, dan generation; pemulihan setelah restart.</w:t>
+            </w:r>
+          </w:p>
+        </w:tc>
+        <w:tc>
+          <w:tcPr>
+            <w:tcW w:type="dxa" w:w="2800"/>
+            <w:vAlign w:val="center"/>
+            <w:tcMar>
+              <w:top w:w="80" w:type="dxa"/>
+              <w:left w:w="100" w:type="dxa"/>
+              <w:bottom w:w="80" w:type="dxa"/>
+              <w:right w:w="100" w:type="dxa"/>
+            </w:tcMar>
+            <w:shd w:fill="F5F8F9"/>
+          </w:tcPr>
+          <w:p>
+            <w:pPr>
+              <w:spacing w:after="20" w:before="0" w:line="247" w:lineRule="auto"/>
+            </w:pPr>
+            <w:r>
+              <w:rPr>
+                <w:b w:val="0"/>
+                <w:sz w:val="18"/>
+              </w:rPr>
+              <w:t xml:space="preserve">Runtime A/B berjalan dalam satu proses (mobilitas logis).</w:t>
+            </w:r>
+          </w:p>
+        </w:tc>
+      </w:tr>
+      <w:tr>
+        <w:trPr>
+          <w:cantSplit/>
+        </w:trPr>
+        <w:tc>
+          <w:tcPr>
+            <w:tcW w:type="dxa" w:w="2200"/>
+            <w:vAlign w:val="center"/>
+            <w:tcMar>
+              <w:top w:w="80" w:type="dxa"/>
+              <w:left w:w="100" w:type="dxa"/>
+              <w:bottom w:w="80" w:type="dxa"/>
+              <w:right w:w="100" w:type="dxa"/>
+            </w:tcMar>
+            <w:shd w:fill="FFFFFF"/>
+          </w:tcPr>
+          <w:p>
+            <w:pPr>
+              <w:spacing w:after="20" w:before="0" w:line="247" w:lineRule="auto"/>
+            </w:pPr>
+            <w:r>
+              <w:rPr>
+                <w:b w:val="0"/>
+                <w:sz w:val="18"/>
+              </w:rPr>
+              <w:t xml:space="preserve">Enrichment Agent</w:t>
+            </w:r>
+          </w:p>
+        </w:tc>
+        <w:tc>
+          <w:tcPr>
+            <w:tcW w:type="dxa" w:w="4978"/>
+            <w:vAlign w:val="center"/>
+            <w:tcMar>
+              <w:top w:w="80" w:type="dxa"/>
+              <w:left w:w="100" w:type="dxa"/>
+              <w:bottom w:w="80" w:type="dxa"/>
+              <w:right w:w="100" w:type="dxa"/>
+            </w:tcMar>
+            <w:shd w:fill="FFFFFF"/>
+          </w:tcPr>
+          <w:p>
+            <w:pPr>
+              <w:spacing w:after="20" w:before="0" w:line="247" w:lineRule="auto"/>
+            </w:pPr>
+            <w:r>
+              <w:rPr>
+                <w:b w:val="0"/>
+                <w:sz w:val="18"/>
+              </w:rPr>
+              <w:t xml:space="preserve">Actor Apify berbasis URL LinkedIn; skor S dari Bagian 6.1; lead tanpa URL dilewati tanpa biaya; petunjuk instansi dari deskripsi lead manual.</w:t>
+            </w:r>
+          </w:p>
+        </w:tc>
+        <w:tc>
+          <w:tcPr>
+            <w:tcW w:type="dxa" w:w="2800"/>
+            <w:vAlign w:val="center"/>
+            <w:tcMar>
+              <w:top w:w="80" w:type="dxa"/>
+              <w:left w:w="100" w:type="dxa"/>
+              <w:bottom w:w="80" w:type="dxa"/>
+              <w:right w:w="100" w:type="dxa"/>
+            </w:tcMar>
+            <w:shd w:fill="FFFFFF"/>
+          </w:tcPr>
+          <w:p>
+            <w:pPr>
+              <w:spacing w:after="20" w:before="0" w:line="247" w:lineRule="auto"/>
+            </w:pPr>
+            <w:r>
+              <w:rPr>
+                <w:b w:val="0"/>
+                <w:sz w:val="18"/>
+              </w:rPr>
+              <w:t xml:space="preserve">Keluaran actor dipetakan dari skema publik; belum diuji dengan run nyata.</w:t>
+            </w:r>
+          </w:p>
+        </w:tc>
+      </w:tr>
+      <w:tr>
+        <w:trPr>
+          <w:cantSplit/>
+        </w:trPr>
+        <w:tc>
+          <w:tcPr>
+            <w:tcW w:type="dxa" w:w="2200"/>
+            <w:vAlign w:val="center"/>
+            <w:tcMar>
+              <w:top w:w="80" w:type="dxa"/>
+              <w:left w:w="100" w:type="dxa"/>
+              <w:bottom w:w="80" w:type="dxa"/>
+              <w:right w:w="100" w:type="dxa"/>
+            </w:tcMar>
+            <w:shd w:fill="F5F8F9"/>
+          </w:tcPr>
+          <w:p>
+            <w:pPr>
+              <w:spacing w:after="20" w:before="0" w:line="247" w:lineRule="auto"/>
+            </w:pPr>
+            <w:r>
+              <w:rPr>
+                <w:b w:val="0"/>
+                <w:sz w:val="18"/>
+              </w:rPr>
+              <w:t xml:space="preserve">Research Agent</w:t>
+            </w:r>
+          </w:p>
+        </w:tc>
+        <w:tc>
+          <w:tcPr>
+            <w:tcW w:type="dxa" w:w="4978"/>
+            <w:vAlign w:val="center"/>
+            <w:tcMar>
+              <w:top w:w="80" w:type="dxa"/>
+              <w:left w:w="100" w:type="dxa"/>
+              <w:bottom w:w="80" w:type="dxa"/>
+              <w:right w:w="100" w:type="dxa"/>
+            </w:tcMar>
+            <w:shd w:fill="F5F8F9"/>
+          </w:tcPr>
+          <w:p>
+            <w:pPr>
+              <w:spacing w:after="20" w:before="0" w:line="247" w:lineRule="auto"/>
+            </w:pPr>
+            <w:r>
+              <w:rPr>
+                <w:b w:val="0"/>
+                <w:sz w:val="18"/>
+              </w:rPr>
+              <w:t xml:space="preserve">Firecrawl Search; halaman wajib menyebut perusahaan (atau nama dan instansi); filter prompt injection; kutipan fakta harus ada persis di sumber.</w:t>
+            </w:r>
+          </w:p>
+        </w:tc>
+        <w:tc>
+          <w:tcPr>
+            <w:tcW w:type="dxa" w:w="2800"/>
+            <w:vAlign w:val="center"/>
+            <w:tcMar>
+              <w:top w:w="80" w:type="dxa"/>
+              <w:left w:w="100" w:type="dxa"/>
+              <w:bottom w:w="80" w:type="dxa"/>
+              <w:right w:w="100" w:type="dxa"/>
+            </w:tcMar>
+            <w:shd w:fill="F5F8F9"/>
+          </w:tcPr>
+          <w:p>
+            <w:pPr>
+              <w:spacing w:after="20" w:before="0" w:line="247" w:lineRule="auto"/>
+            </w:pPr>
+            <w:r>
+              <w:rPr>
+                <w:b w:val="0"/>
+                <w:sz w:val="18"/>
+              </w:rPr>
+              <w:t xml:space="preserve">Maksimal 3 fakta per draft.</w:t>
+            </w:r>
+          </w:p>
+        </w:tc>
+      </w:tr>
+      <w:tr>
+        <w:trPr>
+          <w:cantSplit/>
+        </w:trPr>
+        <w:tc>
+          <w:tcPr>
+            <w:tcW w:type="dxa" w:w="2200"/>
+            <w:vAlign w:val="center"/>
+            <w:tcMar>
+              <w:top w:w="80" w:type="dxa"/>
+              <w:left w:w="100" w:type="dxa"/>
+              <w:bottom w:w="80" w:type="dxa"/>
+              <w:right w:w="100" w:type="dxa"/>
+            </w:tcMar>
+            <w:shd w:fill="FFFFFF"/>
+          </w:tcPr>
+          <w:p>
+            <w:pPr>
+              <w:spacing w:after="20" w:before="0" w:line="247" w:lineRule="auto"/>
+            </w:pPr>
+            <w:r>
+              <w:rPr>
+                <w:b w:val="0"/>
+                <w:sz w:val="18"/>
+              </w:rPr>
+              <w:t xml:space="preserve">Email Writer Agent</w:t>
+            </w:r>
+          </w:p>
+        </w:tc>
+        <w:tc>
+          <w:tcPr>
+            <w:tcW w:type="dxa" w:w="4978"/>
+            <w:vAlign w:val="center"/>
+            <w:tcMar>
+              <w:top w:w="80" w:type="dxa"/>
+              <w:left w:w="100" w:type="dxa"/>
+              <w:bottom w:w="80" w:type="dxa"/>
+              <w:right w:w="100" w:type="dxa"/>
+            </w:tcMar>
+            <w:shd w:fill="FFFFFF"/>
+          </w:tcPr>
+          <w:p>
+            <w:pPr>
+              <w:spacing w:after="20" w:before="0" w:line="247" w:lineRule="auto"/>
+            </w:pPr>
+            <w:r>
+              <w:rPr>
+                <w:b w:val="0"/>
+                <w:sz w:val="18"/>
+              </w:rPr>
+              <w:t xml:space="preserve">Structured output (subject, body, used_fact_ids, warnings); maksimal 2 revisi; kalimat berhenti ditambahkan sistem.</w:t>
+            </w:r>
+          </w:p>
+        </w:tc>
+        <w:tc>
+          <w:tcPr>
+            <w:tcW w:type="dxa" w:w="2800"/>
+            <w:vAlign w:val="center"/>
+            <w:tcMar>
+              <w:top w:w="80" w:type="dxa"/>
+              <w:left w:w="100" w:type="dxa"/>
+              <w:bottom w:w="80" w:type="dxa"/>
+              <w:right w:w="100" w:type="dxa"/>
+            </w:tcMar>
+            <w:shd w:fill="FFFFFF"/>
+          </w:tcPr>
+          <w:p>
+            <w:pPr>
+              <w:spacing w:after="20" w:before="0" w:line="247" w:lineRule="auto"/>
+            </w:pPr>
+            <w:r>
+              <w:rPr>
+                <w:b w:val="0"/>
+                <w:sz w:val="18"/>
+              </w:rPr>
+              <w:t xml:space="preserve">Kualitas bahasa LLM belum dinilai manusia.</w:t>
+            </w:r>
+          </w:p>
+        </w:tc>
+      </w:tr>
+      <w:tr>
+        <w:trPr>
+          <w:cantSplit/>
+        </w:trPr>
+        <w:tc>
+          <w:tcPr>
+            <w:tcW w:type="dxa" w:w="2200"/>
+            <w:vAlign w:val="center"/>
+            <w:tcMar>
+              <w:top w:w="80" w:type="dxa"/>
+              <w:left w:w="100" w:type="dxa"/>
+              <w:bottom w:w="80" w:type="dxa"/>
+              <w:right w:w="100" w:type="dxa"/>
+            </w:tcMar>
+            <w:shd w:fill="F5F8F9"/>
+          </w:tcPr>
+          <w:p>
+            <w:pPr>
+              <w:spacing w:after="20" w:before="0" w:line="247" w:lineRule="auto"/>
+            </w:pPr>
+            <w:r>
+              <w:rPr>
+                <w:b w:val="0"/>
+                <w:sz w:val="18"/>
+              </w:rPr>
+              <w:t xml:space="preserve">Security &amp; Quality Agent</w:t>
+            </w:r>
+          </w:p>
+        </w:tc>
+        <w:tc>
+          <w:tcPr>
+            <w:tcW w:type="dxa" w:w="4978"/>
+            <w:vAlign w:val="center"/>
+            <w:tcMar>
+              <w:top w:w="80" w:type="dxa"/>
+              <w:left w:w="100" w:type="dxa"/>
+              <w:bottom w:w="80" w:type="dxa"/>
+              <w:right w:w="100" w:type="dxa"/>
+            </w:tcMar>
+            <w:shd w:fill="F5F8F9"/>
+          </w:tcPr>
+          <w:p>
+            <w:pPr>
+              <w:spacing w:after="20" w:before="0" w:line="247" w:lineRule="auto"/>
+            </w:pPr>
+            <w:r>
+              <w:rPr>
+                <w:b w:val="0"/>
+                <w:sz w:val="18"/>
+              </w:rPr>
+              <w:t xml:space="preserve">Rule engine: izin, suppression, duplikat, format email, angka tanpa bukti, fakta tak dikenal, insiden.</w:t>
+            </w:r>
+          </w:p>
+        </w:tc>
+        <w:tc>
+          <w:tcPr>
+            <w:tcW w:type="dxa" w:w="2800"/>
+            <w:vAlign w:val="center"/>
+            <w:tcMar>
+              <w:top w:w="80" w:type="dxa"/>
+              <w:left w:w="100" w:type="dxa"/>
+              <w:bottom w:w="80" w:type="dxa"/>
+              <w:right w:w="100" w:type="dxa"/>
+            </w:tcMar>
+            <w:shd w:fill="F5F8F9"/>
+          </w:tcPr>
+          <w:p>
+            <w:pPr>
+              <w:spacing w:after="20" w:before="0" w:line="247" w:lineRule="auto"/>
+            </w:pPr>
+            <w:r>
+              <w:rPr>
+                <w:b w:val="0"/>
+                <w:sz w:val="18"/>
+              </w:rPr>
+              <w:t xml:space="preserve">Tanpa evaluator LLM; BLOCK tidak dapat dibatalkan LLM.</w:t>
+            </w:r>
+          </w:p>
+        </w:tc>
+      </w:tr>
+      <w:tr>
+        <w:trPr>
+          <w:cantSplit/>
+        </w:trPr>
+        <w:tc>
+          <w:tcPr>
+            <w:tcW w:type="dxa" w:w="2200"/>
+            <w:vAlign w:val="center"/>
+            <w:tcMar>
+              <w:top w:w="80" w:type="dxa"/>
+              <w:left w:w="100" w:type="dxa"/>
+              <w:bottom w:w="80" w:type="dxa"/>
+              <w:right w:w="100" w:type="dxa"/>
+            </w:tcMar>
+            <w:shd w:fill="FFFFFF"/>
+          </w:tcPr>
+          <w:p>
+            <w:pPr>
+              <w:spacing w:after="20" w:before="0" w:line="247" w:lineRule="auto"/>
+            </w:pPr>
+            <w:r>
+              <w:rPr>
+                <w:b w:val="0"/>
+                <w:sz w:val="18"/>
+              </w:rPr>
+              <w:t xml:space="preserve">Scheduler &amp; sender</w:t>
+            </w:r>
+          </w:p>
+        </w:tc>
+        <w:tc>
+          <w:tcPr>
+            <w:tcW w:type="dxa" w:w="4978"/>
+            <w:vAlign w:val="center"/>
+            <w:tcMar>
+              <w:top w:w="80" w:type="dxa"/>
+              <w:left w:w="100" w:type="dxa"/>
+              <w:bottom w:w="80" w:type="dxa"/>
+              <w:right w:w="100" w:type="dxa"/>
+            </w:tcMar>
+            <w:shd w:fill="FFFFFF"/>
+          </w:tcPr>
+          <w:p>
+            <w:pPr>
+              <w:spacing w:after="20" w:before="0" w:line="247" w:lineRule="auto"/>
+            </w:pPr>
+            <w:r>
+              <w:rPr>
+                <w:b w:val="0"/>
+                <w:sz w:val="18"/>
+              </w:rPr>
+              <w:t xml:space="preserve">Gmail API dengan OAuth; kunci kirim; status SENDING disimpan sebelum kirim; SENT_UNKNOWN direkonsiliasi manual; allowlist.</w:t>
+            </w:r>
+          </w:p>
+        </w:tc>
+        <w:tc>
+          <w:tcPr>
+            <w:tcW w:type="dxa" w:w="2800"/>
+            <w:vAlign w:val="center"/>
+            <w:tcMar>
+              <w:top w:w="80" w:type="dxa"/>
+              <w:left w:w="100" w:type="dxa"/>
+              <w:bottom w:w="80" w:type="dxa"/>
+              <w:right w:w="100" w:type="dxa"/>
+            </w:tcMar>
+            <w:shd w:fill="FFFFFF"/>
+          </w:tcPr>
+          <w:p>
+            <w:pPr>
+              <w:spacing w:after="20" w:before="0" w:line="247" w:lineRule="auto"/>
+            </w:pPr>
+            <w:r>
+              <w:rPr>
+                <w:b w:val="0"/>
+                <w:sz w:val="18"/>
+              </w:rPr>
+              <w:t xml:space="preserve">Mode draf bila kredensial Gmail tidak diisi.</w:t>
+            </w:r>
+          </w:p>
+        </w:tc>
+      </w:tr>
+      <w:tr>
+        <w:trPr>
+          <w:cantSplit/>
+        </w:trPr>
+        <w:tc>
+          <w:tcPr>
+            <w:tcW w:type="dxa" w:w="2200"/>
+            <w:vAlign w:val="center"/>
+            <w:tcMar>
+              <w:top w:w="80" w:type="dxa"/>
+              <w:left w:w="100" w:type="dxa"/>
+              <w:bottom w:w="80" w:type="dxa"/>
+              <w:right w:w="100" w:type="dxa"/>
+            </w:tcMar>
+            <w:shd w:fill="F5F8F9"/>
+          </w:tcPr>
+          <w:p>
+            <w:pPr>
+              <w:spacing w:after="20" w:before="0" w:line="247" w:lineRule="auto"/>
+            </w:pPr>
+            <w:r>
+              <w:rPr>
+                <w:b w:val="0"/>
+                <w:sz w:val="18"/>
+              </w:rPr>
+              <w:t xml:space="preserve">Data Gateway</w:t>
+            </w:r>
+          </w:p>
+        </w:tc>
+        <w:tc>
+          <w:tcPr>
+            <w:tcW w:type="dxa" w:w="4978"/>
+            <w:vAlign w:val="center"/>
+            <w:tcMar>
+              <w:top w:w="80" w:type="dxa"/>
+              <w:left w:w="100" w:type="dxa"/>
+              <w:bottom w:w="80" w:type="dxa"/>
+              <w:right w:w="100" w:type="dxa"/>
+            </w:tcMar>
+            <w:shd w:fill="F5F8F9"/>
+          </w:tcPr>
+          <w:p>
+            <w:pPr>
+              <w:spacing w:after="20" w:before="0" w:line="247" w:lineRule="auto"/>
+            </w:pPr>
+            <w:r>
+              <w:rPr>
+                <w:b w:val="0"/>
+                <w:sz w:val="18"/>
+              </w:rPr>
+              <w:t xml:space="preserve">Google Sheets 8 tab melalui service account; tulis batch; fallback berkas lokal.</w:t>
+            </w:r>
+          </w:p>
+        </w:tc>
+        <w:tc>
+          <w:tcPr>
+            <w:tcW w:type="dxa" w:w="2800"/>
+            <w:vAlign w:val="center"/>
+            <w:tcMar>
+              <w:top w:w="80" w:type="dxa"/>
+              <w:left w:w="100" w:type="dxa"/>
+              <w:bottom w:w="80" w:type="dxa"/>
+              <w:right w:w="100" w:type="dxa"/>
+            </w:tcMar>
+            <w:shd w:fill="F5F8F9"/>
+          </w:tcPr>
+          <w:p>
+            <w:pPr>
+              <w:spacing w:after="20" w:before="0" w:line="247" w:lineRule="auto"/>
+            </w:pPr>
+            <w:r>
+              <w:rPr>
+                <w:b w:val="0"/>
+                <w:sz w:val="18"/>
+              </w:rPr>
+              <w:t xml:space="preserve">Satu proses penulis.</w:t>
+            </w:r>
+          </w:p>
+        </w:tc>
+      </w:tr>
+      <w:tr>
+        <w:trPr>
+          <w:cantSplit/>
+        </w:trPr>
+        <w:tc>
+          <w:tcPr>
+            <w:tcW w:type="dxa" w:w="2200"/>
+            <w:vAlign w:val="center"/>
+            <w:tcMar>
+              <w:top w:w="80" w:type="dxa"/>
+              <w:left w:w="100" w:type="dxa"/>
+              <w:bottom w:w="80" w:type="dxa"/>
+              <w:right w:w="100" w:type="dxa"/>
+            </w:tcMar>
+            <w:shd w:fill="FFFFFF"/>
+          </w:tcPr>
+          <w:p>
+            <w:pPr>
+              <w:spacing w:after="20" w:before="0" w:line="247" w:lineRule="auto"/>
+            </w:pPr>
+            <w:r>
+              <w:rPr>
+                <w:b w:val="0"/>
+                <w:sz w:val="18"/>
+              </w:rPr>
+              <w:t xml:space="preserve">Dashboard</w:t>
+            </w:r>
+          </w:p>
+        </w:tc>
+        <w:tc>
+          <w:tcPr>
+            <w:tcW w:type="dxa" w:w="4978"/>
+            <w:vAlign w:val="center"/>
+            <w:tcMar>
+              <w:top w:w="80" w:type="dxa"/>
+              <w:left w:w="100" w:type="dxa"/>
+              <w:bottom w:w="80" w:type="dxa"/>
+              <w:right w:w="100" w:type="dxa"/>
+            </w:tcMar>
+            <w:shd w:fill="FFFFFF"/>
+          </w:tcPr>
+          <w:p>
+            <w:pPr>
+              <w:spacing w:after="20" w:before="0" w:line="247" w:lineRule="auto"/>
+            </w:pPr>
+            <w:r>
+              <w:rPr>
+                <w:b w:val="0"/>
+                <w:sz w:val="18"/>
+              </w:rPr>
+              <w:t xml:space="preserve">Setup, Preview &amp; Approval, Monitor, Koneksi; pesan antaragen langsung (SSE).</w:t>
+            </w:r>
+          </w:p>
+        </w:tc>
+        <w:tc>
+          <w:tcPr>
+            <w:tcW w:type="dxa" w:w="2800"/>
+            <w:vAlign w:val="center"/>
+            <w:tcMar>
+              <w:top w:w="80" w:type="dxa"/>
+              <w:left w:w="100" w:type="dxa"/>
+              <w:bottom w:w="80" w:type="dxa"/>
+              <w:right w:w="100" w:type="dxa"/>
+            </w:tcMar>
+            <w:shd w:fill="FFFFFF"/>
+          </w:tcPr>
+          <w:p>
+            <w:pPr>
+              <w:spacing w:after="20" w:before="0" w:line="247" w:lineRule="auto"/>
+            </w:pPr>
+            <w:r>
+              <w:rPr>
+                <w:b w:val="0"/>
+                <w:sz w:val="18"/>
+              </w:rPr>
+              <w:t xml:space="preserve">Diuji di desktop 1440 px dan ponsel 390 px.</w:t>
             </w:r>
           </w:p>
         </w:tc>
@@ -5659,6 +6423,14 @@
     </w:p>
     <w:p>
       <w:r>
+        <w:rPr>
+          <w:b w:val="0"/>
+        </w:rPr>
+        <w:t xml:space="preserve">Pada prototipe, akses Google Sheets memakai service account: spreadsheet cukup dibagikan ke email service account, tanpa token yang disalin manual [19]. Gmail memakai OAuth dengan PKCE melalui tombol “Hubungkan akun Google” dan hanya meminta izin kirim [18]. Token disimpan di berkas privat backend. Bila kredensial Gmail tidak diisi, aplikasi berjalan dalam mode draf.</w:t>
+      </w:r>
+    </w:p>
+    <w:p>
+      <w:r>
         <w:br w:type="page"/>
       </w:r>
     </w:p>
@@ -6157,6 +6929,14 @@
     </w:p>
     <w:p>
       <w:r>
+        <w:rPr>
+          <w:b w:val="0"/>
+        </w:rPr>
+        <w:t xml:space="preserve">Mockup ini telah direalisasikan pada prototipe; tangkapan layarnya ditunjukkan pada Bagian 8.4.</w:t>
+      </w:r>
+    </w:p>
+    <w:p>
+      <w:r>
         <w:br w:type="page"/>
       </w:r>
     </w:p>
@@ -6244,7 +7024,7 @@
                 <w:color w:val="FFFFFF"/>
                 <w:sz w:val="18"/>
               </w:rPr>
-              <w:t>Perilaku yang diharapkan (belum diuji)</w:t>
+              <w:t>Perilaku yang diharapkan</w:t>
             </w:r>
           </w:p>
         </w:tc>
@@ -6597,6 +7377,271 @@
           <w:sz w:val="19"/>
         </w:rPr>
         <w:t>Gmail send-only tidak cukup untuk membaca balasan atau rekonsiliasi kotak terkirim. Fitur pembacaan memerlukan otorisasi tambahan; tanpa itu dilakukan review manual. SENT berarti permintaan kirim diterima API, bukan konfirmasi delivered/read. Kuota, autentikasi, dan mekanisme berhenti berlangganan mengikuti kebijakan layanan. [11][12]</w:t>
+      </w:r>
+    </w:p>
+    <w:p>
+      <w:r>
+        <w:rPr>
+          <w:b w:val="0"/>
+        </w:rPr>
+        <w:t xml:space="preserve">Pada prototipe, lima dari enam lapisan di atas telah diuji otomatis (Bagian 9.3). Kegagalan Gmail diuji dengan transport tiruan; audit dan retensi data belum diuji.</w:t>
+      </w:r>
+    </w:p>
+    <w:p>
+      <w:r>
+        <w:br w:type="page"/>
+      </w:r>
+    </w:p>
+    <w:p>
+      <w:pPr>
+        <w:pStyle w:val="Heading2"/>
+      </w:pPr>
+      <w:r>
+        <w:t xml:space="preserve">8.4 Prototipe yang telah dibangun</w:t>
+      </w:r>
+    </w:p>
+    <w:p>
+      <w:r>
+        <w:rPr>
+          <w:b w:val="0"/>
+        </w:rPr>
+        <w:t xml:space="preserve">Prototipe Outreach Control merealisasikan alur Setup → Preview &amp; Approval → Monitor. Seluruh tangkapan layar berikut diambil dalam mode simulasi dengan data fiktif (domain .example); label “Mode simulasi aktif” sengaja tetap ditampilkan.</w:t>
+      </w:r>
+    </w:p>
+    <w:p>
+      <w:pPr>
+        <w:keepNext/>
+        <w:spacing w:after="0"/>
+        <w:jc w:val="center"/>
+      </w:pPr>
+      <w:r>
+        <w:drawing>
+          <wp:inline xmlns:a="http://schemas.openxmlformats.org/drawingml/2006/main" xmlns:pic="http://schemas.openxmlformats.org/drawingml/2006/picture">
+            <wp:extent cx="6336000" cy="5888960"/>
+            <wp:docPr id="6" name="Picture 6" descr="Dashboard Preview &amp; Approval berisi daftar 100 lead dengan status, draft email untuk Sinta Pramesti, dan jejak bukti dengan sumber CRM, Apify, dan web." title="Gambar 5"/>
+            <wp:cNvGraphicFramePr>
+              <a:graphicFrameLocks noChangeAspect="1"/>
+            </wp:cNvGraphicFramePr>
+            <a:graphic>
+              <a:graphicData uri="http://schemas.openxmlformats.org/drawingml/2006/picture">
+                <pic:pic>
+                  <pic:nvPicPr>
+                    <pic:cNvPr id="0" name="preview-approval.png"/>
+                    <pic:cNvPicPr/>
+                  </pic:nvPicPr>
+                  <pic:blipFill>
+                    <a:blip r:embed="rId44"/>
+                    <a:stretch>
+                      <a:fillRect/>
+                    </a:stretch>
+                  </pic:blipFill>
+                  <pic:spPr>
+                    <a:xfrm>
+                      <a:off x="0" y="0"/>
+                      <a:ext cx="6336000" cy="5888960"/>
+                    </a:xfrm>
+                    <a:prstGeom prst="rect"/>
+                  </pic:spPr>
+                </pic:pic>
+              </a:graphicData>
+            </a:graphic>
+          </wp:inline>
+        </w:drawing>
+      </w:r>
+    </w:p>
+    <w:p>
+      <w:pPr>
+        <w:pStyle w:val="Caption"/>
+      </w:pPr>
+      <w:r>
+        <w:rPr>
+          <w:b w:val="0"/>
+        </w:rPr>
+        <w:t xml:space="preserve">Gambar 5. Preview &amp; Approval: status keputusan Security per lead, draft email, dan jejak bukti bernomor (data fiktif, mode simulasi).</w:t>
+      </w:r>
+    </w:p>
+    <w:p>
+      <w:r>
+        <w:rPr>
+          <w:b/>
+        </w:rPr>
+        <w:t xml:space="preserve">Jejak bukti.</w:t>
+      </w:r>
+      <w:r>
+        <w:rPr>
+          <w:b w:val="0"/>
+        </w:rPr>
+        <w:t xml:space="preserve"> Kata di email yang berasal dari fakta ditandai nomor yang merujuk ke daftar bukti: sumber (CRM, Apify, atau web), waktu pengambilan, skor identitas, dan kutipan asli. Pengguna menyetujui versi draft tertentu; mengedit draft membatalkan approval lama.</w:t>
+      </w:r>
+    </w:p>
+    <w:p>
+      <w:pPr>
+        <w:keepNext/>
+        <w:spacing w:after="0"/>
+        <w:jc w:val="center"/>
+      </w:pPr>
+      <w:r>
+        <w:drawing>
+          <wp:inline xmlns:a="http://schemas.openxmlformats.org/drawingml/2006/main" xmlns:pic="http://schemas.openxmlformats.org/drawingml/2006/picture">
+            <wp:extent cx="6336000" cy="5139200"/>
+            <wp:docPr id="7" name="Picture 7" descr="Panel review identitas dengan empat kandidat bernama Sinta beserta nilai d, n, c, r, dan S, serta tombol Pilih." title="Gambar 6"/>
+            <wp:cNvGraphicFramePr>
+              <a:graphicFrameLocks noChangeAspect="1"/>
+            </wp:cNvGraphicFramePr>
+            <a:graphic>
+              <a:graphicData uri="http://schemas.openxmlformats.org/drawingml/2006/picture">
+                <pic:pic>
+                  <pic:nvPicPr>
+                    <pic:cNvPr id="0" name="review-identitas.png"/>
+                    <pic:cNvPicPr/>
+                  </pic:nvPicPr>
+                  <pic:blipFill>
+                    <a:blip r:embed="rId45"/>
+                    <a:stretch>
+                      <a:fillRect/>
+                    </a:stretch>
+                  </pic:blipFill>
+                  <pic:spPr>
+                    <a:xfrm>
+                      <a:off x="0" y="0"/>
+                      <a:ext cx="6336000" cy="5139200"/>
+                    </a:xfrm>
+                    <a:prstGeom prst="rect"/>
+                  </pic:spPr>
+                </pic:pic>
+              </a:graphicData>
+            </a:graphic>
+          </wp:inline>
+        </w:drawing>
+      </w:r>
+    </w:p>
+    <w:p>
+      <w:pPr>
+        <w:pStyle w:val="Caption"/>
+      </w:pPr>
+      <w:r>
+        <w:rPr>
+          <w:b w:val="0"/>
+        </w:rPr>
+        <w:t xml:space="preserve">Gambar 6. Review identitas: agen tidak menebak; kandidat diurutkan dengan skor S dan pengguna memilih (data fiktif).</w:t>
+      </w:r>
+    </w:p>
+    <w:p>
+      <w:r>
+        <w:rPr>
+          <w:b/>
+        </w:rPr>
+        <w:t xml:space="preserve">Perluasan dari rancangan.</w:t>
+      </w:r>
+      <w:r>
+        <w:rPr>
+          <w:b w:val="0"/>
+        </w:rPr>
+        <w:t xml:space="preserve"> Tiga fitur ditambahkan berdasarkan kebutuhan pengguna selama pengembangan. (1) Lead manual: cukup nama lengkap dan deskripsi, misalnya “Dosen di UGM serta guru besar di sana”; agen membaca instansi dan peran dari deskripsi sebagai petunjuk pencarian, bukan sebagai fakta email. (2) Mode satu penerima: campaign dikunci untuk tepat satu orang di tiga lapis (tambah lead, approval, scheduler). (3) Mode draf: bila kredensial Gmail tidak diisi, keluaran berupa isi email yang difinalkan lalu disalin atau diunduh (.eml, CSV).</w:t>
+      </w:r>
+    </w:p>
+    <w:p>
+      <w:pPr>
+        <w:keepNext/>
+        <w:spacing w:after="0"/>
+        <w:jc w:val="center"/>
+      </w:pPr>
+      <w:r>
+        <w:drawing>
+          <wp:inline xmlns:a="http://schemas.openxmlformats.org/drawingml/2006/main" xmlns:pic="http://schemas.openxmlformats.org/drawingml/2006/picture">
+            <wp:extent cx="5800000" cy="5374666"/>
+            <wp:docPr id="8" name="Picture 8" descr="Halaman Monitor berisi alur task, dua runtime, riwayat migrasi A ke B, antrean kirim, pemakaian, dan log pesan antaragen." title="Gambar 7"/>
+            <wp:cNvGraphicFramePr>
+              <a:graphicFrameLocks noChangeAspect="1"/>
+            </wp:cNvGraphicFramePr>
+            <a:graphic>
+              <a:graphicData uri="http://schemas.openxmlformats.org/drawingml/2006/picture">
+                <pic:pic>
+                  <pic:nvPicPr>
+                    <pic:cNvPr id="0" name="monitor.png"/>
+                    <pic:cNvPicPr/>
+                  </pic:nvPicPr>
+                  <pic:blipFill>
+                    <a:blip r:embed="rId46"/>
+                    <a:stretch>
+                      <a:fillRect/>
+                    </a:stretch>
+                  </pic:blipFill>
+                  <pic:spPr>
+                    <a:xfrm>
+                      <a:off x="0" y="0"/>
+                      <a:ext cx="5800000" cy="5374666"/>
+                    </a:xfrm>
+                    <a:prstGeom prst="rect"/>
+                  </pic:spPr>
+                </pic:pic>
+              </a:graphicData>
+            </a:graphic>
+          </wp:inline>
+        </w:drawing>
+      </w:r>
+    </w:p>
+    <w:p>
+      <w:pPr>
+        <w:pStyle w:val="Caption"/>
+      </w:pPr>
+      <w:r>
+        <w:rPr>
+          <w:b w:val="0"/>
+        </w:rPr>
+        <w:t xml:space="preserve">Gambar 7. Monitor: alur task, runtime A/B beserta riwayat migrasi, antrean kirim, pemakaian layanan, dan pesan antaragen langsung.</w:t>
+      </w:r>
+    </w:p>
+    <w:p>
+      <w:pPr>
+        <w:keepNext/>
+        <w:spacing w:after="0"/>
+        <w:jc w:val="center"/>
+      </w:pPr>
+      <w:r>
+        <w:drawing>
+          <wp:inline xmlns:a="http://schemas.openxmlformats.org/drawingml/2006/main" xmlns:pic="http://schemas.openxmlformats.org/drawingml/2006/picture">
+            <wp:extent cx="4800000" cy="2626666"/>
+            <wp:docPr id="9" name="Picture 9" descr="Draf final untuk Azhari dengan tombol Salin subjek, Salin isi, Salin semua, dan Unduh .eml." title="Gambar 8"/>
+            <wp:cNvGraphicFramePr>
+              <a:graphicFrameLocks noChangeAspect="1"/>
+            </wp:cNvGraphicFramePr>
+            <a:graphic>
+              <a:graphicData uri="http://schemas.openxmlformats.org/drawingml/2006/picture">
+                <pic:pic>
+                  <pic:nvPicPr>
+                    <pic:cNvPr id="0" name="mode-draf-final.png"/>
+                    <pic:cNvPicPr/>
+                  </pic:nvPicPr>
+                  <pic:blipFill>
+                    <a:blip r:embed="rId47"/>
+                    <a:stretch>
+                      <a:fillRect/>
+                    </a:stretch>
+                  </pic:blipFill>
+                  <pic:spPr>
+                    <a:xfrm>
+                      <a:off x="0" y="0"/>
+                      <a:ext cx="4800000" cy="2626666"/>
+                    </a:xfrm>
+                    <a:prstGeom prst="rect"/>
+                  </pic:spPr>
+                </pic:pic>
+              </a:graphicData>
+            </a:graphic>
+          </wp:inline>
+        </w:drawing>
+      </w:r>
+    </w:p>
+    <w:p>
+      <w:pPr>
+        <w:pStyle w:val="Caption"/>
+      </w:pPr>
+      <w:r>
+        <w:rPr>
+          <w:b w:val="0"/>
+        </w:rPr>
+        <w:t xml:space="preserve">Gambar 8. Mode draf: draf final dapat disalin atau diunduh sebagai .eml; aplikasi tidak mengirim email.</w:t>
       </w:r>
     </w:p>
     <w:p>
@@ -7064,7 +8109,7 @@
         <w:drawing>
           <wp:inline xmlns:a="http://schemas.openxmlformats.org/drawingml/2006/main" xmlns:pic="http://schemas.openxmlformats.org/drawingml/2006/picture">
             <wp:extent cx="5760000" cy="1975236"/>
-            <wp:docPr id="5" name="Picture 5" descr="Grafik horizontal menunjukkan 1500 detik untuk workflow statis sekuensial dan 330 detik untuk lima worker paralel dengan overhead 30 detik, sebagai ilustrasi analitis." title="Gambar 5"/>
+            <wp:docPr id="5" name="Picture 5" descr="Grafik horizontal menunjukkan 1500 detik untuk workflow statis sekuensial dan 330 detik untuk lima worker paralel dengan overhead 30 detik, sebagai ilustrasi analitis." title="Gambar 9"/>
             <wp:cNvGraphicFramePr>
               <a:graphicFrameLocks noChangeAspect="1"/>
             </wp:cNvGraphicFramePr>
@@ -7103,7 +8148,7 @@
         <w:rPr>
           <w:b w:val="0"/>
         </w:rPr>
-        <w:t>Gambar 5. Perbandingan waktu persiapan pada model perhitungan sederhana.</w:t>
+        <w:t>Gambar 9. Perbandingan waktu persiapan pada model perhitungan sederhana.</w:t>
       </w:r>
     </w:p>
     <w:tbl>
@@ -7468,6 +8513,1152 @@
     </w:p>
     <w:p>
       <w:pPr>
+        <w:pStyle w:val="Heading2"/>
+      </w:pPr>
+      <w:r>
+        <w:t xml:space="preserve">9.3 Hasil pengujian prototipe</w:t>
+      </w:r>
+    </w:p>
+    <w:p>
+      <w:r>
+        <w:rPr>
+          <w:b w:val="0"/>
+        </w:rPr>
+        <w:t xml:space="preserve">Bukti kualitas prototipe berasal dari dua sumber: tes otomatis yang menyatakan kebutuhan laporan (bukan menyalin implementasi), dan simulasi ujung ke ujung dengan 100 lead fiktif. Layanan eksternal diuji dengan transport tiruan; tidak ada kredit berbayar yang dipakai.</w:t>
+      </w:r>
+    </w:p>
+    <w:tbl>
+      <w:tblPr>
+        <w:tblW w:type="auto" w:w="0"/>
+        <w:jc w:val="center"/>
+        <w:tblLayout w:type="fixed"/>
+        <w:tblLook w:firstColumn="1" w:firstRow="1" w:lastColumn="0" w:lastRow="0" w:noHBand="0" w:noVBand="1" w:val="04A0"/>
+      </w:tblPr>
+      <w:tblGrid>
+        <w:gridCol w:w="1900"/>
+        <w:gridCol w:w="7278"/>
+        <w:gridCol w:w="800"/>
+      </w:tblGrid>
+      <w:tr>
+        <w:trPr>
+          <w:cantSplit/>
+          <w:tblHeader/>
+        </w:trPr>
+        <w:tc>
+          <w:tcPr>
+            <w:tcW w:type="dxa" w:w="1900"/>
+            <w:vAlign w:val="center"/>
+            <w:tcMar>
+              <w:top w:w="80" w:type="dxa"/>
+              <w:left w:w="100" w:type="dxa"/>
+              <w:bottom w:w="80" w:type="dxa"/>
+              <w:right w:w="100" w:type="dxa"/>
+            </w:tcMar>
+            <w:shd w:fill="17656B"/>
+          </w:tcPr>
+          <w:p>
+            <w:pPr>
+              <w:spacing w:after="20" w:before="0" w:line="247" w:lineRule="auto"/>
+            </w:pPr>
+            <w:r>
+              <w:rPr>
+                <w:b/>
+                <w:color w:val="FFFFFF"/>
+                <w:sz w:val="18"/>
+              </w:rPr>
+              <w:t xml:space="preserve">Kelompok uji</w:t>
+            </w:r>
+          </w:p>
+        </w:tc>
+        <w:tc>
+          <w:tcPr>
+            <w:tcW w:type="dxa" w:w="7278"/>
+            <w:vAlign w:val="center"/>
+            <w:tcMar>
+              <w:top w:w="80" w:type="dxa"/>
+              <w:left w:w="100" w:type="dxa"/>
+              <w:bottom w:w="80" w:type="dxa"/>
+              <w:right w:w="100" w:type="dxa"/>
+            </w:tcMar>
+            <w:shd w:fill="17656B"/>
+          </w:tcPr>
+          <w:p>
+            <w:pPr>
+              <w:spacing w:after="20" w:before="0" w:line="247" w:lineRule="auto"/>
+            </w:pPr>
+            <w:r>
+              <w:rPr>
+                <w:b/>
+                <w:color w:val="FFFFFF"/>
+                <w:sz w:val="18"/>
+              </w:rPr>
+              <w:t xml:space="preserve">Yang dibuktikan</w:t>
+            </w:r>
+          </w:p>
+        </w:tc>
+        <w:tc>
+          <w:tcPr>
+            <w:tcW w:type="dxa" w:w="800"/>
+            <w:vAlign w:val="center"/>
+            <w:tcMar>
+              <w:top w:w="80" w:type="dxa"/>
+              <w:left w:w="100" w:type="dxa"/>
+              <w:bottom w:w="80" w:type="dxa"/>
+              <w:right w:w="100" w:type="dxa"/>
+            </w:tcMar>
+            <w:shd w:fill="17656B"/>
+          </w:tcPr>
+          <w:p>
+            <w:pPr>
+              <w:spacing w:after="20" w:before="0" w:line="247" w:lineRule="auto"/>
+            </w:pPr>
+            <w:r>
+              <w:rPr>
+                <w:b/>
+                <w:color w:val="FFFFFF"/>
+                <w:sz w:val="18"/>
+              </w:rPr>
+              <w:t xml:space="preserve">Tes</w:t>
+            </w:r>
+          </w:p>
+        </w:tc>
+      </w:tr>
+      <w:tr>
+        <w:trPr>
+          <w:cantSplit/>
+        </w:trPr>
+        <w:tc>
+          <w:tcPr>
+            <w:tcW w:type="dxa" w:w="1900"/>
+            <w:vAlign w:val="center"/>
+            <w:tcMar>
+              <w:top w:w="80" w:type="dxa"/>
+              <w:left w:w="100" w:type="dxa"/>
+              <w:bottom w:w="80" w:type="dxa"/>
+              <w:right w:w="100" w:type="dxa"/>
+            </w:tcMar>
+            <w:shd w:fill="F5F8F9"/>
+          </w:tcPr>
+          <w:p>
+            <w:pPr>
+              <w:spacing w:after="20" w:before="0" w:line="247" w:lineRule="auto"/>
+            </w:pPr>
+            <w:r>
+              <w:rPr>
+                <w:b w:val="0"/>
+                <w:sz w:val="18"/>
+              </w:rPr>
+              <w:t xml:space="preserve">Agen</w:t>
+            </w:r>
+          </w:p>
+        </w:tc>
+        <w:tc>
+          <w:tcPr>
+            <w:tcW w:type="dxa" w:w="7278"/>
+            <w:vAlign w:val="center"/>
+            <w:tcMar>
+              <w:top w:w="80" w:type="dxa"/>
+              <w:left w:w="100" w:type="dxa"/>
+              <w:bottom w:w="80" w:type="dxa"/>
+              <w:right w:w="100" w:type="dxa"/>
+            </w:tcMar>
+            <w:shd w:fill="F5F8F9"/>
+          </w:tcPr>
+          <w:p>
+            <w:pPr>
+              <w:spacing w:after="20" w:before="0" w:line="247" w:lineRule="auto"/>
+            </w:pPr>
+            <w:r>
+              <w:rPr>
+                <w:b w:val="0"/>
+                <w:sz w:val="18"/>
+              </w:rPr>
+              <w:t xml:space="preserve">Bobot skor S dan aturan terima (S ≥ 0,85, selisih ≥ 0,10); BLOCK untuk kontak tanpa izin, suppression, duplikat, dan email invalid; REVIEW untuk angka tanpa bukti; batas 2 revisi writer; halaman injection dan fakta tanpa kutipan dibuang.</w:t>
+            </w:r>
+          </w:p>
+        </w:tc>
+        <w:tc>
+          <w:tcPr>
+            <w:tcW w:type="dxa" w:w="800"/>
+            <w:vAlign w:val="center"/>
+            <w:tcMar>
+              <w:top w:w="80" w:type="dxa"/>
+              <w:left w:w="100" w:type="dxa"/>
+              <w:bottom w:w="80" w:type="dxa"/>
+              <w:right w:w="100" w:type="dxa"/>
+            </w:tcMar>
+            <w:shd w:fill="F5F8F9"/>
+          </w:tcPr>
+          <w:p>
+            <w:pPr>
+              <w:spacing w:after="20" w:before="0" w:line="247" w:lineRule="auto"/>
+            </w:pPr>
+            <w:r>
+              <w:rPr>
+                <w:b w:val="0"/>
+                <w:sz w:val="18"/>
+              </w:rPr>
+              <w:t xml:space="preserve">9</w:t>
+            </w:r>
+          </w:p>
+        </w:tc>
+      </w:tr>
+      <w:tr>
+        <w:trPr>
+          <w:cantSplit/>
+        </w:trPr>
+        <w:tc>
+          <w:tcPr>
+            <w:tcW w:type="dxa" w:w="1900"/>
+            <w:vAlign w:val="center"/>
+            <w:tcMar>
+              <w:top w:w="80" w:type="dxa"/>
+              <w:left w:w="100" w:type="dxa"/>
+              <w:bottom w:w="80" w:type="dxa"/>
+              <w:right w:w="100" w:type="dxa"/>
+            </w:tcMar>
+            <w:shd w:fill="FFFFFF"/>
+          </w:tcPr>
+          <w:p>
+            <w:pPr>
+              <w:spacing w:after="20" w:before="0" w:line="247" w:lineRule="auto"/>
+            </w:pPr>
+            <w:r>
+              <w:rPr>
+                <w:b w:val="0"/>
+                <w:sz w:val="18"/>
+              </w:rPr>
+              <w:t xml:space="preserve">Orchestrator</w:t>
+            </w:r>
+          </w:p>
+        </w:tc>
+        <w:tc>
+          <w:tcPr>
+            <w:tcW w:type="dxa" w:w="7278"/>
+            <w:vAlign w:val="center"/>
+            <w:tcMar>
+              <w:top w:w="80" w:type="dxa"/>
+              <w:left w:w="100" w:type="dxa"/>
+              <w:bottom w:w="80" w:type="dxa"/>
+              <w:right w:w="100" w:type="dxa"/>
+            </w:tcMar>
+            <w:shd w:fill="FFFFFF"/>
+          </w:tcPr>
+          <w:p>
+            <w:pPr>
+              <w:spacing w:after="20" w:before="0" w:line="247" w:lineRule="auto"/>
+            </w:pPr>
+            <w:r>
+              <w:rPr>
+                <w:b w:val="0"/>
+                <w:sz w:val="18"/>
+              </w:rPr>
+              <w:t xml:space="preserve">Alur lengkap sampai terkirim tanpa duplikasi; approval batal saat draft diedit; migrasi menaikkan generation dan hasil lama ditolak; runtime mati memindahkan task; pemulihan setelah restart (SENDING menjadi SENT_UNKNOWN).</w:t>
+            </w:r>
+          </w:p>
+        </w:tc>
+        <w:tc>
+          <w:tcPr>
+            <w:tcW w:type="dxa" w:w="800"/>
+            <w:vAlign w:val="center"/>
+            <w:tcMar>
+              <w:top w:w="80" w:type="dxa"/>
+              <w:left w:w="100" w:type="dxa"/>
+              <w:bottom w:w="80" w:type="dxa"/>
+              <w:right w:w="100" w:type="dxa"/>
+            </w:tcMar>
+            <w:shd w:fill="FFFFFF"/>
+          </w:tcPr>
+          <w:p>
+            <w:pPr>
+              <w:spacing w:after="20" w:before="0" w:line="247" w:lineRule="auto"/>
+            </w:pPr>
+            <w:r>
+              <w:rPr>
+                <w:b w:val="0"/>
+                <w:sz w:val="18"/>
+              </w:rPr>
+              <w:t xml:space="preserve">7</w:t>
+            </w:r>
+          </w:p>
+        </w:tc>
+      </w:tr>
+      <w:tr>
+        <w:trPr>
+          <w:cantSplit/>
+        </w:trPr>
+        <w:tc>
+          <w:tcPr>
+            <w:tcW w:type="dxa" w:w="1900"/>
+            <w:vAlign w:val="center"/>
+            <w:tcMar>
+              <w:top w:w="80" w:type="dxa"/>
+              <w:left w:w="100" w:type="dxa"/>
+              <w:bottom w:w="80" w:type="dxa"/>
+              <w:right w:w="100" w:type="dxa"/>
+            </w:tcMar>
+            <w:shd w:fill="F5F8F9"/>
+          </w:tcPr>
+          <w:p>
+            <w:pPr>
+              <w:spacing w:after="20" w:before="0" w:line="247" w:lineRule="auto"/>
+            </w:pPr>
+            <w:r>
+              <w:rPr>
+                <w:b w:val="0"/>
+                <w:sz w:val="18"/>
+              </w:rPr>
+              <w:t xml:space="preserve">Integrasi</w:t>
+            </w:r>
+          </w:p>
+        </w:tc>
+        <w:tc>
+          <w:tcPr>
+            <w:tcW w:type="dxa" w:w="7278"/>
+            <w:vAlign w:val="center"/>
+            <w:tcMar>
+              <w:top w:w="80" w:type="dxa"/>
+              <w:left w:w="100" w:type="dxa"/>
+              <w:bottom w:w="80" w:type="dxa"/>
+              <w:right w:w="100" w:type="dxa"/>
+            </w:tcMar>
+            <w:shd w:fill="F5F8F9"/>
+          </w:tcPr>
+          <w:p>
+            <w:pPr>
+              <w:spacing w:after="20" w:before="0" w:line="247" w:lineRule="auto"/>
+            </w:pPr>
+            <w:r>
+              <w:rPr>
+                <w:b w:val="0"/>
+                <w:sz w:val="18"/>
+              </w:rPr>
+              <w:t xml:space="preserve">Bentuk request OpenRouter (structured output), Apify run-sync, Gmail MIME; timeout Gmail menjadi SENT_UNKNOWN; tab dan baris Sheets; JWT service account; OAuth dengan PKCE.</w:t>
+            </w:r>
+          </w:p>
+        </w:tc>
+        <w:tc>
+          <w:tcPr>
+            <w:tcW w:type="dxa" w:w="800"/>
+            <w:vAlign w:val="center"/>
+            <w:tcMar>
+              <w:top w:w="80" w:type="dxa"/>
+              <w:left w:w="100" w:type="dxa"/>
+              <w:bottom w:w="80" w:type="dxa"/>
+              <w:right w:w="100" w:type="dxa"/>
+            </w:tcMar>
+            <w:shd w:fill="F5F8F9"/>
+          </w:tcPr>
+          <w:p>
+            <w:pPr>
+              <w:spacing w:after="20" w:before="0" w:line="247" w:lineRule="auto"/>
+            </w:pPr>
+            <w:r>
+              <w:rPr>
+                <w:b w:val="0"/>
+                <w:sz w:val="18"/>
+              </w:rPr>
+              <w:t xml:space="preserve">10</w:t>
+            </w:r>
+          </w:p>
+        </w:tc>
+      </w:tr>
+      <w:tr>
+        <w:trPr>
+          <w:cantSplit/>
+        </w:trPr>
+        <w:tc>
+          <w:tcPr>
+            <w:tcW w:type="dxa" w:w="1900"/>
+            <w:vAlign w:val="center"/>
+            <w:tcMar>
+              <w:top w:w="80" w:type="dxa"/>
+              <w:left w:w="100" w:type="dxa"/>
+              <w:bottom w:w="80" w:type="dxa"/>
+              <w:right w:w="100" w:type="dxa"/>
+            </w:tcMar>
+            <w:shd w:fill="FFFFFF"/>
+          </w:tcPr>
+          <w:p>
+            <w:pPr>
+              <w:spacing w:after="20" w:before="0" w:line="247" w:lineRule="auto"/>
+            </w:pPr>
+            <w:r>
+              <w:rPr>
+                <w:b w:val="0"/>
+                <w:sz w:val="18"/>
+              </w:rPr>
+              <w:t xml:space="preserve">Enrichment LinkedIn</w:t>
+            </w:r>
+          </w:p>
+        </w:tc>
+        <w:tc>
+          <w:tcPr>
+            <w:tcW w:type="dxa" w:w="7278"/>
+            <w:vAlign w:val="center"/>
+            <w:tcMar>
+              <w:top w:w="80" w:type="dxa"/>
+              <w:left w:w="100" w:type="dxa"/>
+              <w:bottom w:w="80" w:type="dxa"/>
+              <w:right w:w="100" w:type="dxa"/>
+            </w:tcMar>
+            <w:shd w:fill="FFFFFF"/>
+          </w:tcPr>
+          <w:p>
+            <w:pPr>
+              <w:spacing w:after="20" w:before="0" w:line="247" w:lineRule="auto"/>
+            </w:pPr>
+            <w:r>
+              <w:rPr>
+                <w:b w:val="0"/>
+                <w:sz w:val="18"/>
+              </w:rPr>
+              <w:t xml:space="preserve">Lead tanpa URL tidak memanggil Apify; URL identik menjadi petunjuk identitas; halaman yang tidak menyebut perusahaan dibuang.</w:t>
+            </w:r>
+          </w:p>
+        </w:tc>
+        <w:tc>
+          <w:tcPr>
+            <w:tcW w:type="dxa" w:w="800"/>
+            <w:vAlign w:val="center"/>
+            <w:tcMar>
+              <w:top w:w="80" w:type="dxa"/>
+              <w:left w:w="100" w:type="dxa"/>
+              <w:bottom w:w="80" w:type="dxa"/>
+              <w:right w:w="100" w:type="dxa"/>
+            </w:tcMar>
+            <w:shd w:fill="FFFFFF"/>
+          </w:tcPr>
+          <w:p>
+            <w:pPr>
+              <w:spacing w:after="20" w:before="0" w:line="247" w:lineRule="auto"/>
+            </w:pPr>
+            <w:r>
+              <w:rPr>
+                <w:b w:val="0"/>
+                <w:sz w:val="18"/>
+              </w:rPr>
+              <w:t xml:space="preserve">4</w:t>
+            </w:r>
+          </w:p>
+        </w:tc>
+      </w:tr>
+      <w:tr>
+        <w:trPr>
+          <w:cantSplit/>
+        </w:trPr>
+        <w:tc>
+          <w:tcPr>
+            <w:tcW w:type="dxa" w:w="1900"/>
+            <w:vAlign w:val="center"/>
+            <w:tcMar>
+              <w:top w:w="80" w:type="dxa"/>
+              <w:left w:w="100" w:type="dxa"/>
+              <w:bottom w:w="80" w:type="dxa"/>
+              <w:right w:w="100" w:type="dxa"/>
+            </w:tcMar>
+            <w:shd w:fill="F5F8F9"/>
+          </w:tcPr>
+          <w:p>
+            <w:pPr>
+              <w:spacing w:after="20" w:before="0" w:line="247" w:lineRule="auto"/>
+            </w:pPr>
+            <w:r>
+              <w:rPr>
+                <w:b w:val="0"/>
+                <w:sz w:val="18"/>
+              </w:rPr>
+              <w:t xml:space="preserve">Lead manual</w:t>
+            </w:r>
+          </w:p>
+        </w:tc>
+        <w:tc>
+          <w:tcPr>
+            <w:tcW w:type="dxa" w:w="7278"/>
+            <w:vAlign w:val="center"/>
+            <w:tcMar>
+              <w:top w:w="80" w:type="dxa"/>
+              <w:left w:w="100" w:type="dxa"/>
+              <w:bottom w:w="80" w:type="dxa"/>
+              <w:right w:w="100" w:type="dxa"/>
+            </w:tcMar>
+            <w:shd w:fill="F5F8F9"/>
+          </w:tcPr>
+          <w:p>
+            <w:pPr>
+              <w:spacing w:after="20" w:before="0" w:line="247" w:lineRule="auto"/>
+            </w:pPr>
+            <w:r>
+              <w:rPr>
+                <w:b w:val="0"/>
+                <w:sz w:val="18"/>
+              </w:rPr>
+              <w:t xml:space="preserve">Nama + deskripsi cukup; instansi dan peran dibaca dari deskripsi; riset orang hanya memakai halaman yang menyebut nama dan instansi.</w:t>
+            </w:r>
+          </w:p>
+        </w:tc>
+        <w:tc>
+          <w:tcPr>
+            <w:tcW w:type="dxa" w:w="800"/>
+            <w:vAlign w:val="center"/>
+            <w:tcMar>
+              <w:top w:w="80" w:type="dxa"/>
+              <w:left w:w="100" w:type="dxa"/>
+              <w:bottom w:w="80" w:type="dxa"/>
+              <w:right w:w="100" w:type="dxa"/>
+            </w:tcMar>
+            <w:shd w:fill="F5F8F9"/>
+          </w:tcPr>
+          <w:p>
+            <w:pPr>
+              <w:spacing w:after="20" w:before="0" w:line="247" w:lineRule="auto"/>
+            </w:pPr>
+            <w:r>
+              <w:rPr>
+                <w:b w:val="0"/>
+                <w:sz w:val="18"/>
+              </w:rPr>
+              <w:t xml:space="preserve">6</w:t>
+            </w:r>
+          </w:p>
+        </w:tc>
+      </w:tr>
+      <w:tr>
+        <w:trPr>
+          <w:cantSplit/>
+        </w:trPr>
+        <w:tc>
+          <w:tcPr>
+            <w:tcW w:type="dxa" w:w="1900"/>
+            <w:vAlign w:val="center"/>
+            <w:tcMar>
+              <w:top w:w="80" w:type="dxa"/>
+              <w:left w:w="100" w:type="dxa"/>
+              <w:bottom w:w="80" w:type="dxa"/>
+              <w:right w:w="100" w:type="dxa"/>
+            </w:tcMar>
+            <w:shd w:fill="FFFFFF"/>
+          </w:tcPr>
+          <w:p>
+            <w:pPr>
+              <w:spacing w:after="20" w:before="0" w:line="247" w:lineRule="auto"/>
+            </w:pPr>
+            <w:r>
+              <w:rPr>
+                <w:b w:val="0"/>
+                <w:sz w:val="18"/>
+              </w:rPr>
+              <w:t xml:space="preserve">Satu penerima</w:t>
+            </w:r>
+          </w:p>
+        </w:tc>
+        <w:tc>
+          <w:tcPr>
+            <w:tcW w:type="dxa" w:w="7278"/>
+            <w:vAlign w:val="center"/>
+            <w:tcMar>
+              <w:top w:w="80" w:type="dxa"/>
+              <w:left w:w="100" w:type="dxa"/>
+              <w:bottom w:w="80" w:type="dxa"/>
+              <w:right w:w="100" w:type="dxa"/>
+            </w:tcMar>
+            <w:shd w:fill="FFFFFF"/>
+          </w:tcPr>
+          <w:p>
+            <w:pPr>
+              <w:spacing w:after="20" w:before="0" w:line="247" w:lineRule="auto"/>
+            </w:pPr>
+            <w:r>
+              <w:rPr>
+                <w:b w:val="0"/>
+                <w:sz w:val="18"/>
+              </w:rPr>
+              <w:t xml:space="preserve">Kuota satu penerima dijaga saat tambah lead, approval, dan scheduler.</w:t>
+            </w:r>
+          </w:p>
+        </w:tc>
+        <w:tc>
+          <w:tcPr>
+            <w:tcW w:type="dxa" w:w="800"/>
+            <w:vAlign w:val="center"/>
+            <w:tcMar>
+              <w:top w:w="80" w:type="dxa"/>
+              <w:left w:w="100" w:type="dxa"/>
+              <w:bottom w:w="80" w:type="dxa"/>
+              <w:right w:w="100" w:type="dxa"/>
+            </w:tcMar>
+            <w:shd w:fill="FFFFFF"/>
+          </w:tcPr>
+          <w:p>
+            <w:pPr>
+              <w:spacing w:after="20" w:before="0" w:line="247" w:lineRule="auto"/>
+            </w:pPr>
+            <w:r>
+              <w:rPr>
+                <w:b w:val="0"/>
+                <w:sz w:val="18"/>
+              </w:rPr>
+              <w:t xml:space="preserve">2</w:t>
+            </w:r>
+          </w:p>
+        </w:tc>
+      </w:tr>
+      <w:tr>
+        <w:trPr>
+          <w:cantSplit/>
+        </w:trPr>
+        <w:tc>
+          <w:tcPr>
+            <w:tcW w:type="dxa" w:w="1900"/>
+            <w:vAlign w:val="center"/>
+            <w:tcMar>
+              <w:top w:w="80" w:type="dxa"/>
+              <w:left w:w="100" w:type="dxa"/>
+              <w:bottom w:w="80" w:type="dxa"/>
+              <w:right w:w="100" w:type="dxa"/>
+            </w:tcMar>
+            <w:shd w:fill="F5F8F9"/>
+          </w:tcPr>
+          <w:p>
+            <w:pPr>
+              <w:spacing w:after="20" w:before="0" w:line="247" w:lineRule="auto"/>
+            </w:pPr>
+            <w:r>
+              <w:rPr>
+                <w:b w:val="0"/>
+                <w:sz w:val="18"/>
+              </w:rPr>
+              <w:t xml:space="preserve">Mode draf</w:t>
+            </w:r>
+          </w:p>
+        </w:tc>
+        <w:tc>
+          <w:tcPr>
+            <w:tcW w:type="dxa" w:w="7278"/>
+            <w:vAlign w:val="center"/>
+            <w:tcMar>
+              <w:top w:w="80" w:type="dxa"/>
+              <w:left w:w="100" w:type="dxa"/>
+              <w:bottom w:w="80" w:type="dxa"/>
+              <w:right w:w="100" w:type="dxa"/>
+            </w:tcMar>
+            <w:shd w:fill="F5F8F9"/>
+          </w:tcPr>
+          <w:p>
+            <w:pPr>
+              <w:spacing w:after="20" w:before="0" w:line="247" w:lineRule="auto"/>
+            </w:pPr>
+            <w:r>
+              <w:rPr>
+                <w:b w:val="0"/>
+                <w:sz w:val="18"/>
+              </w:rPr>
+              <w:t xml:space="preserve">Tanpa kredensial Gmail aplikasi tetap berjalan; draf difinalkan tanpa email penerima; tidak ada pengiriman; unduhan .eml.</w:t>
+            </w:r>
+          </w:p>
+        </w:tc>
+        <w:tc>
+          <w:tcPr>
+            <w:tcW w:type="dxa" w:w="800"/>
+            <w:vAlign w:val="center"/>
+            <w:tcMar>
+              <w:top w:w="80" w:type="dxa"/>
+              <w:left w:w="100" w:type="dxa"/>
+              <w:bottom w:w="80" w:type="dxa"/>
+              <w:right w:w="100" w:type="dxa"/>
+            </w:tcMar>
+            <w:shd w:fill="F5F8F9"/>
+          </w:tcPr>
+          <w:p>
+            <w:pPr>
+              <w:spacing w:after="20" w:before="0" w:line="247" w:lineRule="auto"/>
+            </w:pPr>
+            <w:r>
+              <w:rPr>
+                <w:b w:val="0"/>
+                <w:sz w:val="18"/>
+              </w:rPr>
+              <w:t xml:space="preserve">4</w:t>
+            </w:r>
+          </w:p>
+        </w:tc>
+      </w:tr>
+      <w:tr>
+        <w:trPr>
+          <w:cantSplit/>
+        </w:trPr>
+        <w:tc>
+          <w:tcPr>
+            <w:tcW w:type="dxa" w:w="1900"/>
+            <w:vAlign w:val="center"/>
+            <w:tcMar>
+              <w:top w:w="80" w:type="dxa"/>
+              <w:left w:w="100" w:type="dxa"/>
+              <w:bottom w:w="80" w:type="dxa"/>
+              <w:right w:w="100" w:type="dxa"/>
+            </w:tcMar>
+            <w:shd w:fill="FFFFFF"/>
+          </w:tcPr>
+          <w:p>
+            <w:pPr>
+              <w:spacing w:after="20" w:before="0" w:line="247" w:lineRule="auto"/>
+            </w:pPr>
+            <w:r>
+              <w:rPr>
+                <w:b w:val="0"/>
+                <w:sz w:val="18"/>
+              </w:rPr>
+              <w:t xml:space="preserve">API</w:t>
+            </w:r>
+          </w:p>
+        </w:tc>
+        <w:tc>
+          <w:tcPr>
+            <w:tcW w:type="dxa" w:w="7278"/>
+            <w:vAlign w:val="center"/>
+            <w:tcMar>
+              <w:top w:w="80" w:type="dxa"/>
+              <w:left w:w="100" w:type="dxa"/>
+              <w:bottom w:w="80" w:type="dxa"/>
+              <w:right w:w="100" w:type="dxa"/>
+            </w:tcMar>
+            <w:shd w:fill="FFFFFF"/>
+          </w:tcPr>
+          <w:p>
+            <w:pPr>
+              <w:spacing w:after="20" w:before="0" w:line="247" w:lineRule="auto"/>
+            </w:pPr>
+            <w:r>
+              <w:rPr>
+                <w:b w:val="0"/>
+                <w:sz w:val="18"/>
+              </w:rPr>
+              <w:t xml:space="preserve">Semua endpoint berjalan di event loop yang sama dengan agen.</w:t>
+            </w:r>
+          </w:p>
+        </w:tc>
+        <w:tc>
+          <w:tcPr>
+            <w:tcW w:type="dxa" w:w="800"/>
+            <w:vAlign w:val="center"/>
+            <w:tcMar>
+              <w:top w:w="80" w:type="dxa"/>
+              <w:left w:w="100" w:type="dxa"/>
+              <w:bottom w:w="80" w:type="dxa"/>
+              <w:right w:w="100" w:type="dxa"/>
+            </w:tcMar>
+            <w:shd w:fill="FFFFFF"/>
+          </w:tcPr>
+          <w:p>
+            <w:pPr>
+              <w:spacing w:after="20" w:before="0" w:line="247" w:lineRule="auto"/>
+            </w:pPr>
+            <w:r>
+              <w:rPr>
+                <w:b w:val="0"/>
+                <w:sz w:val="18"/>
+              </w:rPr>
+              <w:t xml:space="preserve">1</w:t>
+            </w:r>
+          </w:p>
+        </w:tc>
+      </w:tr>
+    </w:tbl>
+    <w:p>
+      <w:pPr>
+        <w:spacing w:after="0" w:before="0" w:line="240" w:lineRule="auto"/>
+      </w:pPr>
+      <w:r>
+        <w:rPr>
+          <w:sz w:val="4"/>
+        </w:rPr>
+      </w:r>
+    </w:p>
+    <w:p>
+      <w:r>
+        <w:rPr>
+          <w:b/>
+        </w:rPr>
+        <w:t xml:space="preserve">Hasil simulasi 100 lead fiktif.</w:t>
+      </w:r>
+      <w:r>
+        <w:rPr>
+          <w:b w:val="0"/>
+        </w:rPr>
+        <w:t xml:space="preserve"> Campaign per lead diproses oleh dua runtime (3 + 2 worker) dengan layanan tiruan. Hasilnya dirangkum pada tabel berikut. Komposisi keputusan berbeda dari ilustrasi Bagian 8.1 (80/15/5) karena data fiktif sengaja memuat kasus uji.</w:t>
+      </w:r>
+    </w:p>
+    <w:tbl>
+      <w:tblPr>
+        <w:tblW w:type="auto" w:w="0"/>
+        <w:jc w:val="center"/>
+        <w:tblLayout w:type="fixed"/>
+        <w:tblLook w:firstColumn="1" w:firstRow="1" w:lastColumn="0" w:lastRow="0" w:noHBand="0" w:noVBand="1" w:val="04A0"/>
+      </w:tblPr>
+      <w:tblGrid>
+        <w:gridCol w:w="2400"/>
+        <w:gridCol w:w="7578"/>
+      </w:tblGrid>
+      <w:tr>
+        <w:trPr>
+          <w:cantSplit/>
+          <w:tblHeader/>
+        </w:trPr>
+        <w:tc>
+          <w:tcPr>
+            <w:tcW w:type="dxa" w:w="2400"/>
+            <w:vAlign w:val="center"/>
+            <w:tcMar>
+              <w:top w:w="80" w:type="dxa"/>
+              <w:left w:w="100" w:type="dxa"/>
+              <w:bottom w:w="80" w:type="dxa"/>
+              <w:right w:w="100" w:type="dxa"/>
+            </w:tcMar>
+            <w:shd w:fill="17656B"/>
+          </w:tcPr>
+          <w:p>
+            <w:pPr>
+              <w:spacing w:after="20" w:before="0" w:line="247" w:lineRule="auto"/>
+            </w:pPr>
+            <w:r>
+              <w:rPr>
+                <w:b/>
+                <w:color w:val="FFFFFF"/>
+                <w:sz w:val="18"/>
+              </w:rPr>
+              <w:t xml:space="preserve">Indikator</w:t>
+            </w:r>
+          </w:p>
+        </w:tc>
+        <w:tc>
+          <w:tcPr>
+            <w:tcW w:type="dxa" w:w="7578"/>
+            <w:vAlign w:val="center"/>
+            <w:tcMar>
+              <w:top w:w="80" w:type="dxa"/>
+              <w:left w:w="100" w:type="dxa"/>
+              <w:bottom w:w="80" w:type="dxa"/>
+              <w:right w:w="100" w:type="dxa"/>
+            </w:tcMar>
+            <w:shd w:fill="17656B"/>
+          </w:tcPr>
+          <w:p>
+            <w:pPr>
+              <w:spacing w:after="20" w:before="0" w:line="247" w:lineRule="auto"/>
+            </w:pPr>
+            <w:r>
+              <w:rPr>
+                <w:b/>
+                <w:color w:val="FFFFFF"/>
+                <w:sz w:val="18"/>
+              </w:rPr>
+              <w:t xml:space="preserve">Hasil pada simulasi</w:t>
+            </w:r>
+          </w:p>
+        </w:tc>
+      </w:tr>
+      <w:tr>
+        <w:trPr>
+          <w:cantSplit/>
+        </w:trPr>
+        <w:tc>
+          <w:tcPr>
+            <w:tcW w:type="dxa" w:w="2400"/>
+            <w:vAlign w:val="center"/>
+            <w:tcMar>
+              <w:top w:w="80" w:type="dxa"/>
+              <w:left w:w="100" w:type="dxa"/>
+              <w:bottom w:w="80" w:type="dxa"/>
+              <w:right w:w="100" w:type="dxa"/>
+            </w:tcMar>
+            <w:shd w:fill="F5F8F9"/>
+          </w:tcPr>
+          <w:p>
+            <w:pPr>
+              <w:spacing w:after="20" w:before="0" w:line="247" w:lineRule="auto"/>
+            </w:pPr>
+            <w:r>
+              <w:rPr>
+                <w:b w:val="0"/>
+                <w:sz w:val="18"/>
+              </w:rPr>
+              <w:t xml:space="preserve">Keputusan Security</w:t>
+            </w:r>
+          </w:p>
+        </w:tc>
+        <w:tc>
+          <w:tcPr>
+            <w:tcW w:type="dxa" w:w="7578"/>
+            <w:vAlign w:val="center"/>
+            <w:tcMar>
+              <w:top w:w="80" w:type="dxa"/>
+              <w:left w:w="100" w:type="dxa"/>
+              <w:bottom w:w="80" w:type="dxa"/>
+              <w:right w:w="100" w:type="dxa"/>
+            </w:tcMar>
+            <w:shd w:fill="F5F8F9"/>
+          </w:tcPr>
+          <w:p>
+            <w:pPr>
+              <w:spacing w:after="20" w:before="0" w:line="247" w:lineRule="auto"/>
+            </w:pPr>
+            <w:r>
+              <w:rPr>
+                <w:b w:val="0"/>
+                <w:sz w:val="18"/>
+              </w:rPr>
+              <w:t xml:space="preserve">76 PASS, 14 REVIEW (13 identitas ambigu, 1 halaman memuat prompt injection), 10 BLOCK (7 tanpa izin, 2 email invalid, 1 duplikat).</w:t>
+            </w:r>
+          </w:p>
+        </w:tc>
+      </w:tr>
+      <w:tr>
+        <w:trPr>
+          <w:cantSplit/>
+        </w:trPr>
+        <w:tc>
+          <w:tcPr>
+            <w:tcW w:type="dxa" w:w="2400"/>
+            <w:vAlign w:val="center"/>
+            <w:tcMar>
+              <w:top w:w="80" w:type="dxa"/>
+              <w:left w:w="100" w:type="dxa"/>
+              <w:bottom w:w="80" w:type="dxa"/>
+              <w:right w:w="100" w:type="dxa"/>
+            </w:tcMar>
+            <w:shd w:fill="FFFFFF"/>
+          </w:tcPr>
+          <w:p>
+            <w:pPr>
+              <w:spacing w:after="20" w:before="0" w:line="247" w:lineRule="auto"/>
+            </w:pPr>
+            <w:r>
+              <w:rPr>
+                <w:b w:val="0"/>
+                <w:sz w:val="18"/>
+              </w:rPr>
+              <w:t xml:space="preserve">Koordinasi agen</w:t>
+            </w:r>
+          </w:p>
+        </w:tc>
+        <w:tc>
+          <w:tcPr>
+            <w:tcW w:type="dxa" w:w="7578"/>
+            <w:vAlign w:val="center"/>
+            <w:tcMar>
+              <w:top w:w="80" w:type="dxa"/>
+              <w:left w:w="100" w:type="dxa"/>
+              <w:bottom w:w="80" w:type="dxa"/>
+              <w:right w:w="100" w:type="dxa"/>
+            </w:tcMar>
+            <w:shd w:fill="FFFFFF"/>
+          </w:tcPr>
+          <w:p>
+            <w:pPr>
+              <w:spacing w:after="20" w:before="0" w:line="247" w:lineRule="auto"/>
+            </w:pPr>
+            <w:r>
+              <w:rPr>
+                <w:b w:val="0"/>
+                <w:sz w:val="18"/>
+              </w:rPr>
+              <w:t xml:space="preserve">1.012 pesan antaragen: 200 CFP, 200 PROPOSE, 100 ACCEPT, 100 REJECT, 244 INFORM_RESULT, 79 REQUEST ke Security.</w:t>
+            </w:r>
+          </w:p>
+        </w:tc>
+      </w:tr>
+      <w:tr>
+        <w:trPr>
+          <w:cantSplit/>
+        </w:trPr>
+        <w:tc>
+          <w:tcPr>
+            <w:tcW w:type="dxa" w:w="2400"/>
+            <w:vAlign w:val="center"/>
+            <w:tcMar>
+              <w:top w:w="80" w:type="dxa"/>
+              <w:left w:w="100" w:type="dxa"/>
+              <w:bottom w:w="80" w:type="dxa"/>
+              <w:right w:w="100" w:type="dxa"/>
+            </w:tcMar>
+            <w:shd w:fill="F5F8F9"/>
+          </w:tcPr>
+          <w:p>
+            <w:pPr>
+              <w:spacing w:after="20" w:before="0" w:line="247" w:lineRule="auto"/>
+            </w:pPr>
+            <w:r>
+              <w:rPr>
+                <w:b w:val="0"/>
+                <w:sz w:val="18"/>
+              </w:rPr>
+              <w:t xml:space="preserve">Mobilitas</w:t>
+            </w:r>
+          </w:p>
+        </w:tc>
+        <w:tc>
+          <w:tcPr>
+            <w:tcW w:type="dxa" w:w="7578"/>
+            <w:vAlign w:val="center"/>
+            <w:tcMar>
+              <w:top w:w="80" w:type="dxa"/>
+              <w:left w:w="100" w:type="dxa"/>
+              <w:bottom w:w="80" w:type="dxa"/>
+              <w:right w:w="100" w:type="dxa"/>
+            </w:tcMar>
+            <w:shd w:fill="F5F8F9"/>
+          </w:tcPr>
+          <w:p>
+            <w:pPr>
+              <w:spacing w:after="20" w:before="0" w:line="247" w:lineRule="auto"/>
+            </w:pPr>
+            <w:r>
+              <w:rPr>
+                <w:b w:val="0"/>
+                <w:sz w:val="18"/>
+              </w:rPr>
+              <w:t xml:space="preserve">2 task dipindah dari runtime A ke B di tengah proses; generation naik ke 2 dan task selesai dari checkpoint.</w:t>
+            </w:r>
+          </w:p>
+        </w:tc>
+      </w:tr>
+      <w:tr>
+        <w:trPr>
+          <w:cantSplit/>
+        </w:trPr>
+        <w:tc>
+          <w:tcPr>
+            <w:tcW w:type="dxa" w:w="2400"/>
+            <w:vAlign w:val="center"/>
+            <w:tcMar>
+              <w:top w:w="80" w:type="dxa"/>
+              <w:left w:w="100" w:type="dxa"/>
+              <w:bottom w:w="80" w:type="dxa"/>
+              <w:right w:w="100" w:type="dxa"/>
+            </w:tcMar>
+            <w:shd w:fill="FFFFFF"/>
+          </w:tcPr>
+          <w:p>
+            <w:pPr>
+              <w:spacing w:after="20" w:before="0" w:line="247" w:lineRule="auto"/>
+            </w:pPr>
+            <w:r>
+              <w:rPr>
+                <w:b w:val="0"/>
+                <w:sz w:val="18"/>
+              </w:rPr>
+              <w:t xml:space="preserve">Pengiriman</w:t>
+            </w:r>
+          </w:p>
+        </w:tc>
+        <w:tc>
+          <w:tcPr>
+            <w:tcW w:type="dxa" w:w="7578"/>
+            <w:vAlign w:val="center"/>
+            <w:tcMar>
+              <w:top w:w="80" w:type="dxa"/>
+              <w:left w:w="100" w:type="dxa"/>
+              <w:bottom w:w="80" w:type="dxa"/>
+              <w:right w:w="100" w:type="dxa"/>
+            </w:tcMar>
+            <w:shd w:fill="FFFFFF"/>
+          </w:tcPr>
+          <w:p>
+            <w:pPr>
+              <w:spacing w:after="20" w:before="0" w:line="247" w:lineRule="auto"/>
+            </w:pPr>
+            <w:r>
+              <w:rPr>
+                <w:b w:val="0"/>
+                <w:sz w:val="18"/>
+              </w:rPr>
+              <w:t xml:space="preserve">4 draft disetujui; 1 diterima Gmail tiruan (penerima di allowlist), 3 diblokir karena di luar allowlist.</w:t>
+            </w:r>
+          </w:p>
+        </w:tc>
+      </w:tr>
+      <w:tr>
+        <w:trPr>
+          <w:cantSplit/>
+        </w:trPr>
+        <w:tc>
+          <w:tcPr>
+            <w:tcW w:type="dxa" w:w="2400"/>
+            <w:vAlign w:val="center"/>
+            <w:tcMar>
+              <w:top w:w="80" w:type="dxa"/>
+              <w:left w:w="100" w:type="dxa"/>
+              <w:bottom w:w="80" w:type="dxa"/>
+              <w:right w:w="100" w:type="dxa"/>
+            </w:tcMar>
+            <w:shd w:fill="F5F8F9"/>
+          </w:tcPr>
+          <w:p>
+            <w:pPr>
+              <w:spacing w:after="20" w:before="0" w:line="247" w:lineRule="auto"/>
+            </w:pPr>
+            <w:r>
+              <w:rPr>
+                <w:b w:val="0"/>
+                <w:sz w:val="18"/>
+              </w:rPr>
+              <w:t xml:space="preserve">Waktu</w:t>
+            </w:r>
+          </w:p>
+        </w:tc>
+        <w:tc>
+          <w:tcPr>
+            <w:tcW w:type="dxa" w:w="7578"/>
+            <w:vAlign w:val="center"/>
+            <w:tcMar>
+              <w:top w:w="80" w:type="dxa"/>
+              <w:left w:w="100" w:type="dxa"/>
+              <w:bottom w:w="80" w:type="dxa"/>
+              <w:right w:w="100" w:type="dxa"/>
+            </w:tcMar>
+            <w:shd w:fill="F5F8F9"/>
+          </w:tcPr>
+          <w:p>
+            <w:pPr>
+              <w:spacing w:after="20" w:before="0" w:line="247" w:lineRule="auto"/>
+            </w:pPr>
+            <w:r>
+              <w:rPr>
+                <w:b w:val="0"/>
+                <w:sz w:val="18"/>
+              </w:rPr>
+              <w:t xml:space="preserve">100 lead selesai dalam ±48 detik; rata-rata persiapan 2,7 detik per lead (p95 3,2 detik). Latensi layanan tiruan dibuat 0,6–1,6 detik, sehingga angka ini bukan ukuran kinerja nyata.</w:t>
+            </w:r>
+          </w:p>
+        </w:tc>
+      </w:tr>
+    </w:tbl>
+    <w:p>
+      <w:pPr>
+        <w:spacing w:after="0" w:before="0" w:line="240" w:lineRule="auto"/>
+      </w:pPr>
+      <w:r>
+        <w:rPr>
+          <w:sz w:val="4"/>
+        </w:rPr>
+      </w:r>
+    </w:p>
+    <w:p>
+      <w:r>
+        <w:rPr>
+          <w:b/>
+        </w:rPr>
+        <w:t xml:space="preserve">Belum diuji:</w:t>
+      </w:r>
+      <w:r>
+        <w:rPr>
+          <w:b w:val="0"/>
+        </w:rPr>
+        <w:t xml:space="preserve"> kualitas email dari LLM sungguhan, run nyata actor Apify, pengiriman Gmail ke penerima nyata, dan pembandingan A/B/C pada Bagian 9.1. Keempatnya menjadi langkah berikutnya dan perlu anggaran layanan.</w:t>
+      </w:r>
+    </w:p>
+    <w:p>
+      <w:pPr>
         <w:pStyle w:val="Heading1"/>
       </w:pPr>
       <w:r>
@@ -7479,7 +9670,7 @@
         <w:rPr>
           <w:b w:val="0"/>
         </w:rPr>
-        <w:t>Sistem yang diusulkan memisahkan riset, enrichment, penulisan, dan pengawasan agar konteks tiap agen tetap kecil dan hasil dapat ditelusuri. Orchestrator menjaga dependensi, anggaran, serta status; manusia memegang approval, sementara scheduler dan Gmail sender mengeksekusi pengiriman terkontrol.</w:t>
+        <w:t>Sistem yang diusulkan memisahkan riset, enrichment, penulisan, dan pengawasan agar konteks tiap agen tetap kecil dan hasil dapat ditelusuri. Orchestrator menjaga dependensi, anggaran, serta status; manusia memegang approval, sementara scheduler dan Gmail sender mengeksekusi pengiriman terkontrol. Prototipe membuktikan bahwa alur tersebut dapat dijalankan dari ujung ke ujung: 100 lead fiktif diproses menjadi keputusan yang dapat diaudit, dengan migrasi task, penolakan hasil generation lama, dan pengaman kirim yang teruji otomatis.</w:t>
       </w:r>
     </w:p>
     <w:p>
@@ -7495,7 +9686,7 @@
           <w:b w:val="0"/>
           <w:sz w:val="19"/>
         </w:rPr>
-        <w:t xml:space="preserve"> validasi kualitas entitas dan keamanan lebih dahulu; lanjutkan CRM nyata serta dua runtime cloud untuk uji mobilitas. Adaptive AI/RL baru diaktifkan setelah evaluasi offline. Untuk skala lebih besar, evaluasi database transaksional dan antrean khusus sebagai evolusi dari spreadsheet. Blockchain bukan prioritas: log audit terkontrol lebih sederhana, dan data pribadi tidak layak disimpan pada catatan publik yang sulit dihapus.</w:t>
+        <w:t xml:space="preserve"> uji terbatas dengan layanan live memakai mode satu penerima dan mode draf; pelabelan data untuk validasi kualitas entitas; menjalankan pembandingan A/B/C pada Bagian 9.1; lanjutkan CRM nyata serta dua runtime cloud untuk uji mobilitas. Adaptive AI/RL baru diaktifkan setelah evaluasi offline. Untuk skala lebih besar, evaluasi database transaksional dan antrean khusus sebagai evolusi dari spreadsheet. Blockchain bukan prioritas: log audit terkontrol lebih sederhana, dan data pribadi tidak layak disimpan pada catatan publik yang sulit dihapus.</w:t>
       </w:r>
     </w:p>
     <w:p>
@@ -7517,7 +9708,7 @@
           <w:b w:val="0"/>
           <w:sz w:val="18"/>
         </w:rPr>
-        <w:t>Dokumentasi primer dan penelitian yang mendasari rancangan. Tautan diperiksa pada 17 September 2026; fitur layanan dapat berubah. Nomor [n] pada isi merujuk ke daftar berikut.</w:t>
+        <w:t>Dokumentasi primer dan penelitian yang mendasari rancangan. Tautan diperiksa pada 17 dan 22 September 2026; fitur layanan dapat berubah. Nomor [n] pada isi merujuk ke daftar berikut.</w:t>
       </w:r>
     </w:p>
     <w:p>
@@ -8018,6 +10209,72 @@
     </w:p>
     <w:p>
       <w:pPr>
+        <w:spacing w:after="100" w:line="245" w:lineRule="auto"/>
+      </w:pPr>
+      <w:r>
+        <w:rPr>
+          <w:b w:val="0"/>
+          <w:sz w:val="17"/>
+        </w:rPr>
+        <w:t xml:space="preserve">[17] OpenRouter. Structured Outputs: keluaran JSON sesuai skema. </w:t>
+      </w:r>
+      <w:hyperlink r:id="rId41">
+        <w:r>
+          <w:rPr>
+            <w:color w:val="17656B"/>
+            <w:sz w:val="17"/>
+            <w:u w:val="single"/>
+          </w:rPr>
+          <w:t>Dokumentasi</w:t>
+        </w:r>
+      </w:hyperlink>
+    </w:p>
+    <w:p>
+      <w:pPr>
+        <w:spacing w:after="100" w:line="245" w:lineRule="auto"/>
+      </w:pPr>
+      <w:r>
+        <w:rPr>
+          <w:b w:val="0"/>
+          <w:sz w:val="17"/>
+        </w:rPr>
+        <w:t xml:space="preserve">[18] Google. OAuth 2.0 for iOS &amp; Desktop Apps: loopback redirect dan PKCE. </w:t>
+      </w:r>
+      <w:hyperlink r:id="rId42">
+        <w:r>
+          <w:rPr>
+            <w:color w:val="17656B"/>
+            <w:sz w:val="17"/>
+            <w:u w:val="single"/>
+          </w:rPr>
+          <w:t>Dokumentasi</w:t>
+        </w:r>
+      </w:hyperlink>
+    </w:p>
+    <w:p>
+      <w:pPr>
+        <w:spacing w:after="100" w:line="245" w:lineRule="auto"/>
+      </w:pPr>
+      <w:r>
+        <w:rPr>
+          <w:b w:val="0"/>
+          <w:sz w:val="17"/>
+        </w:rPr>
+        <w:t xml:space="preserve">[19] Google. Using OAuth 2.0 for Server to Server Applications (service account). </w:t>
+      </w:r>
+      <w:hyperlink r:id="rId43">
+        <w:r>
+          <w:rPr>
+            <w:color w:val="17656B"/>
+            <w:sz w:val="17"/>
+            <w:u w:val="single"/>
+          </w:rPr>
+          <w:t>Dokumentasi</w:t>
+        </w:r>
+      </w:hyperlink>
+    </w:p>
+    <w:p>
+      <w:pPr>
         <w:pStyle w:val="Heading1"/>
       </w:pPr>
       <w:r>
@@ -8040,7 +10297,7 @@
         <w:tc>
           <w:tcPr>
             <w:tcW w:type="dxa" w:w="9978"/>
-            <w:shd w:fill="FFF4DB"/>
+            <w:shd w:fill="EAF3F3"/>
             <w:tcMar>
               <w:top w:w="120" w:type="dxa"/>
               <w:left w:w="120" w:type="dxa"/>
@@ -8057,7 +10314,7 @@
                 <w:b/>
                 <w:sz w:val="18"/>
               </w:rPr>
-              <w:t>Repositori kelompok: belum disertakan</w:t>
+              <w:t xml:space="preserve">Repositori kelompok</w:t>
             </w:r>
           </w:p>
           <w:p>
@@ -8069,7 +10326,7 @@
                 <w:b w:val="0"/>
                 <w:sz w:val="18"/>
               </w:rPr>
-              <w:t>Status saat ini: rancangan sistem; kode implementasi belum dilampirkan. Bagian ini dilengkapi dengan URL repositori kelompok setelah implementasi tersedia.</w:t>
+              <w:t xml:space="preserve">https://github.com/adityanrrhmn/agen-cerdas-enterprise (privat; akses diberikan kepada anggota kelompok dan penilai atas permintaan). README memuat cara instalasi, konfigurasi layanan, dan pembagian peran.</w:t>
             </w:r>
           </w:p>
         </w:tc>
@@ -8091,14 +10348,14 @@
           <w:b/>
           <w:sz w:val="18"/>
         </w:rPr>
-        <w:t>Struktur implementasi yang disarankan:</w:t>
+        <w:t xml:space="preserve">Struktur implementasi:</w:t>
       </w:r>
       <w:r>
         <w:rPr>
           <w:b w:val="0"/>
           <w:sz w:val="18"/>
         </w:rPr>
-        <w:t xml:space="preserve"> orchestrator/, agents/{enrichment,research,writer,security}, adapters/{sheets,apify,firecrawl,gmail,crm}, scheduler/, dashboard/, serta tests/. Sertakan README, .env.example tanpa rahasia, data sintetis, pengujian keamanan, dan langkah menjalankan dry-run.</w:t>
+        <w:t xml:space="preserve"> backend/app/ (orchestrator, agen, scheduler, adapter, Data Gateway, API), backend/tests/ (43 tes), frontend/src/ (dashboard React), docs/ (runbook, peta laporan, gambar), tools/ (pemeriksa laporan, screenshot), .env.example tanpa rahasia, dan data fiktif. Menjalankan: powershell -ExecutionPolicy Bypass -File run-dev.ps1; pengujian: python -m pytest -q.</w:t>
       </w:r>
     </w:p>
     <w:sectPr>
@@ -8128,7 +10385,7 @@
         <w:color w:val="52666C"/>
         <w:sz w:val="16"/>
       </w:rPr>
-      <w:t>Email Writer &amp; Enrichment  •  Rancangan sistem</w:t>
+      <w:t>Email Writer &amp; Enrichment  •  Rancangan &amp; prototipe</w:t>
     </w:r>
     <w:r>
       <w:tab/>

</xml_diff>